<commit_message>
Justificación: numerado en el cuerpo en todos los modelos
La captura del proceso de manuales marca que el documento ubica el número del 1 kg en la cúpula y que el
criterio FLAMA es grabarlo en el cuerpo en todos los modelos. Links al commit 8b2bfec.

Co-Authored-By: Claude Opus 5.5 <noreply@anthropic.com>
Claude-Session: https://claude.ai/code/session_01E33CYXtZ2f33D1RjoRdR65
</commit_message>
<xml_diff>
--- a/salida/justificacion/Justificacion de medidas planos.docx
+++ b/salida/justificacion/Justificacion de medidas planos.docx
@@ -10008,7 +10008,7 @@
                 <w:sz w:val="13"/>
                 <w:szCs w:val="13"/>
               </w:rPr>
-              <w:t xml:space="preserve">Numerado: desarrollo de 2,5-10 kg; en el 1 kg el número va en la cúpula  ·  </w:t>
+              <w:t xml:space="preserve">Numerado en el cuerpo (desarrollo de 2,5-10 kg). El documento pone el del 1 kg en la cúpula; criterio FLAMA: va en el cuerpo en todos los modelos  ·  </w:t>
             </w:r>
             <w:r>
               <w:rPr>
@@ -10112,7 +10112,7 @@
           <w:sz w:val="16"/>
           <w:szCs w:val="16"/>
         </w:rPr>
-        <w:t xml:space="preserve">Línea exacta del generador de planos (commit 9cf9127). Amarillo = decisión de diseño a confirmar con el proveedor o el prototipo; naranja = a validar.</w:t>
+        <w:t xml:space="preserve">Línea exacta del generador de planos (commit 8b2bfec). Amarillo = decisión de diseño a confirmar con el proveedor o el prototipo; naranja = a validar.</w:t>
       </w:r>
     </w:p>
     <w:tbl>
@@ -10455,7 +10455,7 @@
             </w:tcMar>
           </w:tcPr>
           <w:p>
-            <w:hyperlink w:history="1" r:id="rIdxgnktj4ijmirhhml_nwfc">
+            <w:hyperlink w:history="1" r:id="rIdgwlddtchafmigkos0gh_x">
               <w:r>
                 <w:rPr>
                   <w:rStyle w:val="Hyperlink"/>
@@ -10615,7 +10615,7 @@
             </w:tcMar>
           </w:tcPr>
           <w:p>
-            <w:hyperlink w:history="1" r:id="rIdi0vii6vnn6bl7truwmkih">
+            <w:hyperlink w:history="1" r:id="rIdni-zj2osjbmv6ziwfpfas">
               <w:r>
                 <w:rPr>
                   <w:rStyle w:val="Hyperlink"/>
@@ -10775,7 +10775,7 @@
             </w:tcMar>
           </w:tcPr>
           <w:p>
-            <w:hyperlink w:history="1" r:id="rIdoe9m8xpc5ikcreu973itn">
+            <w:hyperlink w:history="1" r:id="rIdcxtw6ytrlqyjmyf9_hjdu">
               <w:r>
                 <w:rPr>
                   <w:rStyle w:val="Hyperlink"/>
@@ -10935,7 +10935,7 @@
             </w:tcMar>
           </w:tcPr>
           <w:p>
-            <w:hyperlink w:history="1" r:id="rIdoidbtzxiz_ri1zdfm12ma">
+            <w:hyperlink w:history="1" r:id="rIdex0m3pipu9o1rktrszdue">
               <w:r>
                 <w:rPr>
                   <w:rStyle w:val="Hyperlink"/>
@@ -11095,7 +11095,7 @@
             </w:tcMar>
           </w:tcPr>
           <w:p>
-            <w:hyperlink w:history="1" r:id="rIdwua_yecrapfydo13p-v-3">
+            <w:hyperlink w:history="1" r:id="rIdfkn8awfki5thhnlvo4gyc">
               <w:r>
                 <w:rPr>
                   <w:rStyle w:val="Hyperlink"/>
@@ -11255,7 +11255,7 @@
             </w:tcMar>
           </w:tcPr>
           <w:p>
-            <w:hyperlink w:history="1" r:id="rIdnivaluclweavuzqobbugi">
+            <w:hyperlink w:history="1" r:id="rId7mvieor6riycrungiwrzx">
               <w:r>
                 <w:rPr>
                   <w:rStyle w:val="Hyperlink"/>
@@ -11415,7 +11415,7 @@
             </w:tcMar>
           </w:tcPr>
           <w:p>
-            <w:hyperlink w:history="1" r:id="rIdptjktljqyqk22gdbaccwh">
+            <w:hyperlink w:history="1" r:id="rIdg73qftgfyjdbxjk-jlwg5">
               <w:r>
                 <w:rPr>
                   <w:rStyle w:val="Hyperlink"/>
@@ -11575,7 +11575,7 @@
             </w:tcMar>
           </w:tcPr>
           <w:p>
-            <w:hyperlink w:history="1" r:id="rIdvpy9w81p5cxtr6uwjmtym">
+            <w:hyperlink w:history="1" r:id="rIdeiteow1ftzzri2zkwq_ey">
               <w:r>
                 <w:rPr>
                   <w:rStyle w:val="Hyperlink"/>
@@ -11583,7 +11583,7 @@
                   <w:sz w:val="13"/>
                   <w:szCs w:val="13"/>
                 </w:rPr>
-                <w:t xml:space="preserve">modelo3d.py:851</w:t>
+                <w:t xml:space="preserve">modelo3d.py:852</w:t>
               </w:r>
             </w:hyperlink>
           </w:p>
@@ -11735,7 +11735,7 @@
             </w:tcMar>
           </w:tcPr>
           <w:p>
-            <w:hyperlink w:history="1" r:id="rIdv-bijjfxm0aw-_87lqykz">
+            <w:hyperlink w:history="1" r:id="rIdhlljlf2yhuqbzjdndexnc">
               <w:r>
                 <w:rPr>
                   <w:rStyle w:val="Hyperlink"/>
@@ -11895,7 +11895,7 @@
             </w:tcMar>
           </w:tcPr>
           <w:p>
-            <w:hyperlink w:history="1" r:id="rId6wcp7yjdkrevvcvp1sd8i">
+            <w:hyperlink w:history="1" r:id="rId5bbv313no0vsgvlhuzogr">
               <w:r>
                 <w:rPr>
                   <w:rStyle w:val="Hyperlink"/>
@@ -12055,7 +12055,7 @@
             </w:tcMar>
           </w:tcPr>
           <w:p>
-            <w:hyperlink w:history="1" r:id="rIdcmhgc-cdiamqhpuzdpqgg">
+            <w:hyperlink w:history="1" r:id="rIdxbyjb5fy_9bch2oirtiix">
               <w:r>
                 <w:rPr>
                   <w:rStyle w:val="Hyperlink"/>
@@ -12215,7 +12215,7 @@
             </w:tcMar>
           </w:tcPr>
           <w:p>
-            <w:hyperlink w:history="1" r:id="rIdqeat8kdsjpafsjgtrurfe">
+            <w:hyperlink w:history="1" r:id="rIdfql5klulwcnxa2ztw0tgh">
               <w:r>
                 <w:rPr>
                   <w:rStyle w:val="Hyperlink"/>
@@ -12375,7 +12375,7 @@
             </w:tcMar>
           </w:tcPr>
           <w:p>
-            <w:hyperlink w:history="1" r:id="rId10nt2k9xu65cbobtyfaga">
+            <w:hyperlink w:history="1" r:id="rIdk6wq2yf334kx6wryi-ad0">
               <w:r>
                 <w:rPr>
                   <w:rStyle w:val="Hyperlink"/>
@@ -12535,7 +12535,7 @@
             </w:tcMar>
           </w:tcPr>
           <w:p>
-            <w:hyperlink w:history="1" r:id="rIdmp5z4krv06qhlsvm-gpbh">
+            <w:hyperlink w:history="1" r:id="rIdyohubtltdq5q_alrq2f6x">
               <w:r>
                 <w:rPr>
                   <w:rStyle w:val="Hyperlink"/>
@@ -12695,7 +12695,7 @@
             </w:tcMar>
           </w:tcPr>
           <w:p>
-            <w:hyperlink w:history="1" r:id="rIdtqk3tttzapsomvu24u_yu">
+            <w:hyperlink w:history="1" r:id="rIdg2ll4irqtdsqdbpgy9ukt">
               <w:r>
                 <w:rPr>
                   <w:rStyle w:val="Hyperlink"/>
@@ -12855,7 +12855,7 @@
             </w:tcMar>
           </w:tcPr>
           <w:p>
-            <w:hyperlink w:history="1" r:id="rIdn1pvbx0rbtyrr7bawfex8">
+            <w:hyperlink w:history="1" r:id="rIdwqvzhsgj3ro40cetz1tci">
               <w:r>
                 <w:rPr>
                   <w:rStyle w:val="Hyperlink"/>
@@ -13015,7 +13015,7 @@
             </w:tcMar>
           </w:tcPr>
           <w:p>
-            <w:hyperlink w:history="1" r:id="rId5q0vui_g_ssyvzk3ar_re">
+            <w:hyperlink w:history="1" r:id="rIdbkswiatloqgark3f0nbdv">
               <w:r>
                 <w:rPr>
                   <w:rStyle w:val="Hyperlink"/>
@@ -13175,7 +13175,7 @@
             </w:tcMar>
           </w:tcPr>
           <w:p>
-            <w:hyperlink w:history="1" r:id="rIdj-biroqyaxt2agla8hlxt">
+            <w:hyperlink w:history="1" r:id="rIdsjoc8imhcnmfyldxlev7m">
               <w:r>
                 <w:rPr>
                   <w:rStyle w:val="Hyperlink"/>
@@ -13335,7 +13335,7 @@
             </w:tcMar>
           </w:tcPr>
           <w:p>
-            <w:hyperlink w:history="1" r:id="rIdre_kzn_ncpo5zfobx6uky">
+            <w:hyperlink w:history="1" r:id="rIdlfddjl5-l16puzd9emygm">
               <w:r>
                 <w:rPr>
                   <w:rStyle w:val="Hyperlink"/>
@@ -13495,7 +13495,7 @@
             </w:tcMar>
           </w:tcPr>
           <w:p>
-            <w:hyperlink w:history="1" r:id="rIdreq2j9cercp-9v5soskpe">
+            <w:hyperlink w:history="1" r:id="rIdz1tz_vf-lmbzvtx6_-dmw">
               <w:r>
                 <w:rPr>
                   <w:rStyle w:val="Hyperlink"/>
@@ -13655,7 +13655,7 @@
             </w:tcMar>
           </w:tcPr>
           <w:p>
-            <w:hyperlink w:history="1" r:id="rIdn_b9fxkkoasgocgqznh8m">
+            <w:hyperlink w:history="1" r:id="rIddsqiwrp2ws_aql3rjm3-y">
               <w:r>
                 <w:rPr>
                   <w:rStyle w:val="Hyperlink"/>
@@ -13815,7 +13815,7 @@
             </w:tcMar>
           </w:tcPr>
           <w:p>
-            <w:hyperlink w:history="1" r:id="rIdptvjiwend6dwkp4cplmxi">
+            <w:hyperlink w:history="1" r:id="rIdqwar7sn4t1a9sxfdhzsum">
               <w:r>
                 <w:rPr>
                   <w:rStyle w:val="Hyperlink"/>
@@ -13975,7 +13975,7 @@
             </w:tcMar>
           </w:tcPr>
           <w:p>
-            <w:hyperlink w:history="1" r:id="rId74agcycol-fut0tcxglsq">
+            <w:hyperlink w:history="1" r:id="rIdohzagxpyek84lqwgcwybv">
               <w:r>
                 <w:rPr>
                   <w:rStyle w:val="Hyperlink"/>
@@ -14135,7 +14135,7 @@
             </w:tcMar>
           </w:tcPr>
           <w:p>
-            <w:hyperlink w:history="1" r:id="rId8q_jlcyleepz8vsccy3pz">
+            <w:hyperlink w:history="1" r:id="rIdn1mxnxpn3puzwxkqpmoqw">
               <w:r>
                 <w:rPr>
                   <w:rStyle w:val="Hyperlink"/>
@@ -14295,7 +14295,7 @@
             </w:tcMar>
           </w:tcPr>
           <w:p>
-            <w:hyperlink w:history="1" r:id="rIdcjpzc2deg24dtjfvt2gxf">
+            <w:hyperlink w:history="1" r:id="rIduvjvzb57k_ls0z-ogwsx7">
               <w:r>
                 <w:rPr>
                   <w:rStyle w:val="Hyperlink"/>
@@ -14455,7 +14455,7 @@
             </w:tcMar>
           </w:tcPr>
           <w:p>
-            <w:hyperlink w:history="1" r:id="rIdgj0hj6qbwnl6vcrpwejif">
+            <w:hyperlink w:history="1" r:id="rId79kqiyypel2oxet5f8c1t">
               <w:r>
                 <w:rPr>
                   <w:rStyle w:val="Hyperlink"/>
@@ -14615,7 +14615,7 @@
             </w:tcMar>
           </w:tcPr>
           <w:p>
-            <w:hyperlink w:history="1" r:id="rIdeyh9rpbmtds5qorfj9zsa">
+            <w:hyperlink w:history="1" r:id="rIddm6c4fo-_q49vungc_rkv">
               <w:r>
                 <w:rPr>
                   <w:rStyle w:val="Hyperlink"/>
@@ -14775,7 +14775,7 @@
             </w:tcMar>
           </w:tcPr>
           <w:p>
-            <w:hyperlink w:history="1" r:id="rIdw71u28czm3vxeexvzc5cu">
+            <w:hyperlink w:history="1" r:id="rIdd6ezfalyvrtupkmfldxq3">
               <w:r>
                 <w:rPr>
                   <w:rStyle w:val="Hyperlink"/>
@@ -14935,7 +14935,7 @@
             </w:tcMar>
           </w:tcPr>
           <w:p>
-            <w:hyperlink w:history="1" r:id="rIdkzvahcnvaenrjz0znc-zp">
+            <w:hyperlink w:history="1" r:id="rIdluwepk7m7fadb8_ei2wqk">
               <w:r>
                 <w:rPr>
                   <w:rStyle w:val="Hyperlink"/>
@@ -15095,7 +15095,7 @@
             </w:tcMar>
           </w:tcPr>
           <w:p>
-            <w:hyperlink w:history="1" r:id="rIdckoldhsiui8kzlwbevlfd">
+            <w:hyperlink w:history="1" r:id="rIdcklugmnhsnzf2j8iszqtf">
               <w:r>
                 <w:rPr>
                   <w:rStyle w:val="Hyperlink"/>
@@ -15255,7 +15255,7 @@
             </w:tcMar>
           </w:tcPr>
           <w:p>
-            <w:hyperlink w:history="1" r:id="rIdkmgurhpewuc6rnpxef35r">
+            <w:hyperlink w:history="1" r:id="rIdu0k1gjjwcmnvf9inbcjae">
               <w:r>
                 <w:rPr>
                   <w:rStyle w:val="Hyperlink"/>
@@ -15415,7 +15415,7 @@
             </w:tcMar>
           </w:tcPr>
           <w:p>
-            <w:hyperlink w:history="1" r:id="rIdhuwnlmp2qlm__6mckq79p">
+            <w:hyperlink w:history="1" r:id="rIdxg1lkfdbabvgptrxby-yu">
               <w:r>
                 <w:rPr>
                   <w:rStyle w:val="Hyperlink"/>
@@ -15575,7 +15575,7 @@
             </w:tcMar>
           </w:tcPr>
           <w:p>
-            <w:hyperlink w:history="1" r:id="rId8pd908ahp60ipsvel72xa">
+            <w:hyperlink w:history="1" r:id="rIdzleiuwdl__dohkdif8c7z">
               <w:r>
                 <w:rPr>
                   <w:rStyle w:val="Hyperlink"/>
@@ -15735,7 +15735,7 @@
             </w:tcMar>
           </w:tcPr>
           <w:p>
-            <w:hyperlink w:history="1" r:id="rIdu3jhwspnaoejyo6pgf9o1">
+            <w:hyperlink w:history="1" r:id="rIdycesypjr2xx16qlv4ear_">
               <w:r>
                 <w:rPr>
                   <w:rStyle w:val="Hyperlink"/>
@@ -15895,7 +15895,7 @@
             </w:tcMar>
           </w:tcPr>
           <w:p>
-            <w:hyperlink w:history="1" r:id="rIdkbkvrgmfz1xfviakwzmja">
+            <w:hyperlink w:history="1" r:id="rId0xpwhbr_jssrrtsydjcnu">
               <w:r>
                 <w:rPr>
                   <w:rStyle w:val="Hyperlink"/>
@@ -16055,7 +16055,7 @@
             </w:tcMar>
           </w:tcPr>
           <w:p>
-            <w:hyperlink w:history="1" r:id="rIdt4qxqfgqepd2v7ffxollh">
+            <w:hyperlink w:history="1" r:id="rIdopciwi4ednqlsmtsrdqsd">
               <w:r>
                 <w:rPr>
                   <w:rStyle w:val="Hyperlink"/>
@@ -16215,7 +16215,7 @@
             </w:tcMar>
           </w:tcPr>
           <w:p>
-            <w:hyperlink w:history="1" r:id="rIdiflw3ipby8r2nkfa5wlew">
+            <w:hyperlink w:history="1" r:id="rIdh2n3kp8uoit7l5kmgy9le">
               <w:r>
                 <w:rPr>
                   <w:rStyle w:val="Hyperlink"/>
@@ -16375,7 +16375,7 @@
             </w:tcMar>
           </w:tcPr>
           <w:p>
-            <w:hyperlink w:history="1" r:id="rIddqm8rily0ulnuktvi3p75">
+            <w:hyperlink w:history="1" r:id="rId6ln6vvfmkgxehyb9psn6q">
               <w:r>
                 <w:rPr>
                   <w:rStyle w:val="Hyperlink"/>
@@ -16535,7 +16535,7 @@
             </w:tcMar>
           </w:tcPr>
           <w:p>
-            <w:hyperlink w:history="1" r:id="rIdsv60d00hyzvlfbosv3iel">
+            <w:hyperlink w:history="1" r:id="rIdpjfhcbbv5ypfdwxxxr2xf">
               <w:r>
                 <w:rPr>
                   <w:rStyle w:val="Hyperlink"/>

</xml_diff>

<commit_message>
Justificación: compaginación sin huecos (13 páginas)
Cada fila de figuras es su propia tabla, así el título de sección queda unido
sólo a la primera fila también en LibreOffice. Las tablas del análisis llevan
el título del grupo como encabezado repetido y sus filas pueden cortarse.
ajuste.py mide el PDF y, página por página, sube la fila que saltó achicando
un poco las imágenes o agranda las de la página hasta llenarla; la escala de
cada fila queda en escala.json.

Co-Authored-By: Claude Opus 5.5 <noreply@anthropic.com>
Claude-Session: https://claude.ai/code/session_01E33CYXtZ2f33D1RjoRdR65
</commit_message>
<xml_diff>
--- a/salida/justificacion/Justificacion de medidas planos.docx
+++ b/salida/justificacion/Justificacion de medidas planos.docx
@@ -1429,7 +1429,7 @@
             <w:r>
               <w:drawing>
                 <wp:inline distT="0" distB="0" distL="0" distR="0">
-                  <wp:extent cx="1990725" cy="3000375"/>
+                  <wp:extent cx="1504950" cy="2266950"/>
                   <wp:effectExtent t="0" r="0" b="0" l="0"/>
                   <wp:docPr id="1" name="F01" descr="Plano Fadesa «1kg 3pulg R1» (código G809)" title="F01"/>
                   <wp:cNvGraphicFramePr>
@@ -1454,7 +1454,7 @@
                         <pic:spPr bwMode="auto">
                           <a:xfrm>
                             <a:off x="0" y="0"/>
-                            <a:ext cx="1990725" cy="3000375"/>
+                            <a:ext cx="1504950" cy="2266950"/>
                           </a:xfrm>
                           <a:prstGeom prst="rect">
                             <a:avLst/>
@@ -1801,7 +1801,7 @@
             <w:r>
               <w:drawing>
                 <wp:inline distT="0" distB="0" distL="0" distR="0">
-                  <wp:extent cx="2076450" cy="3000375"/>
+                  <wp:extent cx="1571625" cy="2266950"/>
                   <wp:effectExtent t="0" r="0" b="0" l="0"/>
                   <wp:docPr id="2" name="F02" descr="Plano Fadesa «Recipiente_2.5kg_R2_sin_logo» (código G731)" title="F02"/>
                   <wp:cNvGraphicFramePr>
@@ -1826,7 +1826,7 @@
                         <pic:spPr bwMode="auto">
                           <a:xfrm>
                             <a:off x="0" y="0"/>
-                            <a:ext cx="2076450" cy="3000375"/>
+                            <a:ext cx="1571625" cy="2266950"/>
                           </a:xfrm>
                           <a:prstGeom prst="rect">
                             <a:avLst/>
@@ -2088,6 +2088,28 @@
           </w:p>
         </w:tc>
       </w:tr>
+    </w:tbl>
+    <w:p>
+      <w:pPr>
+        <w:spacing w:after="0" w:before="0" w:line="20" w:lineRule="exact"/>
+      </w:pPr>
+    </w:p>
+    <w:tbl>
+      <w:tblPr>
+        <w:tblW w:type="dxa" w:w="10306"/>
+        <w:tblBorders>
+          <w:top w:val="none" w:color="FFFFFF" w:sz="0"/>
+          <w:left w:val="none" w:color="FFFFFF" w:sz="0"/>
+          <w:bottom w:val="none" w:color="FFFFFF" w:sz="0"/>
+          <w:right w:val="none" w:color="FFFFFF" w:sz="0"/>
+          <w:insideH w:val="none" w:color="FFFFFF" w:sz="0"/>
+          <w:insideV w:val="none" w:color="FFFFFF" w:sz="0"/>
+        </w:tblBorders>
+      </w:tblPr>
+      <w:tblGrid>
+        <w:gridCol w:w="5153"/>
+        <w:gridCol w:w="5153"/>
+      </w:tblGrid>
       <w:tr>
         <w:trPr>
           <w:cantSplit/>
@@ -2143,7 +2165,7 @@
             <w:r>
               <w:drawing>
                 <wp:inline distT="0" distB="0" distL="0" distR="0">
-                  <wp:extent cx="2238375" cy="3000375"/>
+                  <wp:extent cx="2667000" cy="3571875"/>
                   <wp:effectExtent t="0" r="0" b="0" l="0"/>
                   <wp:docPr id="3" name="F03" descr="Plano Fadesa «Recipiente_5kg_R2_sin_logo» (código G732)" title="F03"/>
                   <wp:cNvGraphicFramePr>
@@ -2168,7 +2190,7 @@
                         <pic:spPr bwMode="auto">
                           <a:xfrm>
                             <a:off x="0" y="0"/>
-                            <a:ext cx="2238375" cy="3000375"/>
+                            <a:ext cx="2667000" cy="3571875"/>
                           </a:xfrm>
                           <a:prstGeom prst="rect">
                             <a:avLst/>
@@ -2518,7 +2540,7 @@
             <w:r>
               <w:drawing>
                 <wp:inline distT="0" distB="0" distL="0" distR="0">
-                  <wp:extent cx="1771650" cy="3000375"/>
+                  <wp:extent cx="2105025" cy="3571875"/>
                   <wp:effectExtent t="0" r="0" b="0" l="0"/>
                   <wp:docPr id="4" name="F04" descr="Plano Fadesa «Recipiente_10kg_R2_sin_logo» (código G733)" title="F04"/>
                   <wp:cNvGraphicFramePr>
@@ -2543,7 +2565,7 @@
                         <pic:spPr bwMode="auto">
                           <a:xfrm>
                             <a:off x="0" y="0"/>
-                            <a:ext cx="1771650" cy="3000375"/>
+                            <a:ext cx="2105025" cy="3571875"/>
                           </a:xfrm>
                           <a:prstGeom prst="rect">
                             <a:avLst/>
@@ -2843,6 +2865,28 @@
           </w:p>
         </w:tc>
       </w:tr>
+    </w:tbl>
+    <w:p>
+      <w:pPr>
+        <w:spacing w:after="0" w:before="0" w:line="20" w:lineRule="exact"/>
+      </w:pPr>
+    </w:p>
+    <w:tbl>
+      <w:tblPr>
+        <w:tblW w:type="dxa" w:w="10306"/>
+        <w:tblBorders>
+          <w:top w:val="none" w:color="FFFFFF" w:sz="0"/>
+          <w:left w:val="none" w:color="FFFFFF" w:sz="0"/>
+          <w:bottom w:val="none" w:color="FFFFFF" w:sz="0"/>
+          <w:right w:val="none" w:color="FFFFFF" w:sz="0"/>
+          <w:insideH w:val="none" w:color="FFFFFF" w:sz="0"/>
+          <w:insideV w:val="none" w:color="FFFFFF" w:sz="0"/>
+        </w:tblBorders>
+      </w:tblPr>
+      <w:tblGrid>
+        <w:gridCol w:w="5153"/>
+        <w:gridCol w:w="5153"/>
+      </w:tblGrid>
       <w:tr>
         <w:trPr>
           <w:cantSplit/>
@@ -2898,7 +2942,7 @@
             <w:r>
               <w:drawing>
                 <wp:inline distT="0" distB="0" distL="0" distR="0">
-                  <wp:extent cx="1971675" cy="3000375"/>
+                  <wp:extent cx="2343150" cy="3571875"/>
                   <wp:effectExtent t="0" r="0" b="0" l="0"/>
                   <wp:docPr id="5" name="F05" descr="Plano Fadesa «Recipiente 25kg R3» (código G690)" title="F05"/>
                   <wp:cNvGraphicFramePr>
@@ -2923,7 +2967,7 @@
                         <pic:spPr bwMode="auto">
                           <a:xfrm>
                             <a:off x="0" y="0"/>
-                            <a:ext cx="1971675" cy="3000375"/>
+                            <a:ext cx="2343150" cy="3571875"/>
                           </a:xfrm>
                           <a:prstGeom prst="rect">
                             <a:avLst/>
@@ -3289,7 +3333,7 @@
             <w:r>
               <w:drawing>
                 <wp:inline distT="0" distB="0" distL="0" distR="0">
-                  <wp:extent cx="1809750" cy="3000375"/>
+                  <wp:extent cx="2152650" cy="3571875"/>
                   <wp:effectExtent t="0" r="0" b="0" l="0"/>
                   <wp:docPr id="6" name="F06" descr="Plano Fadesa «Recipiente 50kg R2» (código G689)" title="F06"/>
                   <wp:cNvGraphicFramePr>
@@ -3314,7 +3358,7 @@
                         <pic:spPr bwMode="auto">
                           <a:xfrm>
                             <a:off x="0" y="0"/>
-                            <a:ext cx="1809750" cy="3000375"/>
+                            <a:ext cx="2152650" cy="3571875"/>
                           </a:xfrm>
                           <a:prstGeom prst="rect">
                             <a:avLst/>
@@ -3593,6 +3637,11 @@
         </w:tc>
       </w:tr>
     </w:tbl>
+    <w:p>
+      <w:pPr>
+        <w:spacing w:after="0" w:before="0" w:line="20" w:lineRule="exact"/>
+      </w:pPr>
+    </w:p>
     <w:p>
       <w:pPr>
         <w:pStyle w:val="Heading1"/>
@@ -3693,7 +3742,7 @@
             <w:r>
               <w:drawing>
                 <wp:inline distT="0" distB="0" distL="0" distR="0">
-                  <wp:extent cx="1647825" cy="3000375"/>
+                  <wp:extent cx="1752600" cy="3190875"/>
                   <wp:effectExtent t="0" r="0" b="0" l="0"/>
                   <wp:docPr id="7" name="F07" descr="Plano Fadesa «Extintor 1kg Ø76 (Válvula HZ) R1» (código A114/117/122/123/138)" title="F07"/>
                   <wp:cNvGraphicFramePr>
@@ -3718,7 +3767,7 @@
                         <pic:spPr bwMode="auto">
                           <a:xfrm>
                             <a:off x="0" y="0"/>
-                            <a:ext cx="1647825" cy="3000375"/>
+                            <a:ext cx="1752600" cy="3190875"/>
                           </a:xfrm>
                           <a:prstGeom prst="rect">
                             <a:avLst/>
@@ -3970,7 +4019,7 @@
             <w:r>
               <w:drawing>
                 <wp:inline distT="0" distB="0" distL="0" distR="0">
-                  <wp:extent cx="2066925" cy="3000375"/>
+                  <wp:extent cx="2200275" cy="3190875"/>
                   <wp:effectExtent t="0" r="0" b="0" l="0"/>
                   <wp:docPr id="8" name="F08" descr="Plano Fadesa «Extintor_2.5kg_Valvula_HZ_R1_sin_logo» (código A101/139/151/128/135)" title="F08"/>
                   <wp:cNvGraphicFramePr>
@@ -3995,7 +4044,7 @@
                         <pic:spPr bwMode="auto">
                           <a:xfrm>
                             <a:off x="0" y="0"/>
-                            <a:ext cx="2066925" cy="3000375"/>
+                            <a:ext cx="2200275" cy="3190875"/>
                           </a:xfrm>
                           <a:prstGeom prst="rect">
                             <a:avLst/>
@@ -4254,6 +4303,28 @@
           </w:p>
         </w:tc>
       </w:tr>
+    </w:tbl>
+    <w:p>
+      <w:pPr>
+        <w:spacing w:after="0" w:before="0" w:line="20" w:lineRule="exact"/>
+      </w:pPr>
+    </w:p>
+    <w:tbl>
+      <w:tblPr>
+        <w:tblW w:type="dxa" w:w="10306"/>
+        <w:tblBorders>
+          <w:top w:val="none" w:color="FFFFFF" w:sz="0"/>
+          <w:left w:val="none" w:color="FFFFFF" w:sz="0"/>
+          <w:bottom w:val="none" w:color="FFFFFF" w:sz="0"/>
+          <w:right w:val="none" w:color="FFFFFF" w:sz="0"/>
+          <w:insideH w:val="none" w:color="FFFFFF" w:sz="0"/>
+          <w:insideV w:val="none" w:color="FFFFFF" w:sz="0"/>
+        </w:tblBorders>
+      </w:tblPr>
+      <w:tblGrid>
+        <w:gridCol w:w="5153"/>
+        <w:gridCol w:w="5153"/>
+      </w:tblGrid>
       <w:tr>
         <w:trPr>
           <w:cantSplit/>
@@ -4309,7 +4380,7 @@
             <w:r>
               <w:drawing>
                 <wp:inline distT="0" distB="0" distL="0" distR="0">
-                  <wp:extent cx="1981200" cy="3000375"/>
+                  <wp:extent cx="2114550" cy="3190875"/>
                   <wp:effectExtent t="0" r="0" b="0" l="0"/>
                   <wp:docPr id="9" name="F09" descr="Plano Fadesa «Extintor_5kg_Valvula_HZ_R1_sin_logo» (código A102/116/140/163/152/111/129/136)" title="F09"/>
                   <wp:cNvGraphicFramePr>
@@ -4334,7 +4405,7 @@
                         <pic:spPr bwMode="auto">
                           <a:xfrm>
                             <a:off x="0" y="0"/>
-                            <a:ext cx="1981200" cy="3000375"/>
+                            <a:ext cx="2114550" cy="3190875"/>
                           </a:xfrm>
                           <a:prstGeom prst="rect">
                             <a:avLst/>
@@ -4643,7 +4714,7 @@
             <w:r>
               <w:drawing>
                 <wp:inline distT="0" distB="0" distL="0" distR="0">
-                  <wp:extent cx="1847850" cy="3000375"/>
+                  <wp:extent cx="1971675" cy="3190875"/>
                   <wp:effectExtent t="0" r="0" b="0" l="0"/>
                   <wp:docPr id="10" name="F10" descr="Plano Fadesa «Extintor_10kg_HZ_R1_sin_logo» (código A103/141/164/153/112/130/137)" title="F10"/>
                   <wp:cNvGraphicFramePr>
@@ -4668,7 +4739,7 @@
                         <pic:spPr bwMode="auto">
                           <a:xfrm>
                             <a:off x="0" y="0"/>
-                            <a:ext cx="1847850" cy="3000375"/>
+                            <a:ext cx="1971675" cy="3190875"/>
                           </a:xfrm>
                           <a:prstGeom prst="rect">
                             <a:avLst/>
@@ -4946,6 +5017,28 @@
           </w:p>
         </w:tc>
       </w:tr>
+    </w:tbl>
+    <w:p>
+      <w:pPr>
+        <w:spacing w:after="0" w:before="0" w:line="20" w:lineRule="exact"/>
+      </w:pPr>
+    </w:p>
+    <w:tbl>
+      <w:tblPr>
+        <w:tblW w:type="dxa" w:w="10306"/>
+        <w:tblBorders>
+          <w:top w:val="none" w:color="FFFFFF" w:sz="0"/>
+          <w:left w:val="none" w:color="FFFFFF" w:sz="0"/>
+          <w:bottom w:val="none" w:color="FFFFFF" w:sz="0"/>
+          <w:right w:val="none" w:color="FFFFFF" w:sz="0"/>
+          <w:insideH w:val="none" w:color="FFFFFF" w:sz="0"/>
+          <w:insideV w:val="none" w:color="FFFFFF" w:sz="0"/>
+        </w:tblBorders>
+      </w:tblPr>
+      <w:tblGrid>
+        <w:gridCol w:w="5153"/>
+        <w:gridCol w:w="5153"/>
+      </w:tblGrid>
       <w:tr>
         <w:trPr>
           <w:cantSplit/>
@@ -5001,7 +5094,7 @@
             <w:r>
               <w:drawing>
                 <wp:inline distT="0" distB="0" distL="0" distR="0">
-                  <wp:extent cx="2447925" cy="3000375"/>
+                  <wp:extent cx="2857500" cy="3505200"/>
                   <wp:effectExtent t="0" r="0" b="0" l="0"/>
                   <wp:docPr id="11" name="F11" descr="Plano Fadesa «Extintor rodante 25kg R1» (código B202/204/217/225/229/235)" title="F11"/>
                   <wp:cNvGraphicFramePr>
@@ -5026,7 +5119,7 @@
                         <pic:spPr bwMode="auto">
                           <a:xfrm>
                             <a:off x="0" y="0"/>
-                            <a:ext cx="2447925" cy="3000375"/>
+                            <a:ext cx="2857500" cy="3505200"/>
                           </a:xfrm>
                           <a:prstGeom prst="rect">
                             <a:avLst/>
@@ -5297,7 +5390,7 @@
             <w:r>
               <w:drawing>
                 <wp:inline distT="0" distB="0" distL="0" distR="0">
-                  <wp:extent cx="2505075" cy="3000375"/>
+                  <wp:extent cx="2924175" cy="3505200"/>
                   <wp:effectExtent t="0" r="0" b="0" l="0"/>
                   <wp:docPr id="12" name="F12" descr="Plano Fadesa «Extintor rodante 50kg R1» (código B206/216/222/230/232/236/247)" title="F12"/>
                   <wp:cNvGraphicFramePr>
@@ -5322,7 +5415,7 @@
                         <pic:spPr bwMode="auto">
                           <a:xfrm>
                             <a:off x="0" y="0"/>
-                            <a:ext cx="2505075" cy="3000375"/>
+                            <a:ext cx="2924175" cy="3505200"/>
                           </a:xfrm>
                           <a:prstGeom prst="rect">
                             <a:avLst/>
@@ -5486,6 +5579,28 @@
           </w:p>
         </w:tc>
       </w:tr>
+    </w:tbl>
+    <w:p>
+      <w:pPr>
+        <w:spacing w:after="0" w:before="0" w:line="20" w:lineRule="exact"/>
+      </w:pPr>
+    </w:p>
+    <w:tbl>
+      <w:tblPr>
+        <w:tblW w:type="dxa" w:w="10306"/>
+        <w:tblBorders>
+          <w:top w:val="none" w:color="FFFFFF" w:sz="0"/>
+          <w:left w:val="none" w:color="FFFFFF" w:sz="0"/>
+          <w:bottom w:val="none" w:color="FFFFFF" w:sz="0"/>
+          <w:right w:val="none" w:color="FFFFFF" w:sz="0"/>
+          <w:insideH w:val="none" w:color="FFFFFF" w:sz="0"/>
+          <w:insideV w:val="none" w:color="FFFFFF" w:sz="0"/>
+        </w:tblBorders>
+      </w:tblPr>
+      <w:tblGrid>
+        <w:gridCol w:w="5153"/>
+        <w:gridCol w:w="5153"/>
+      </w:tblGrid>
       <w:tr>
         <w:trPr>
           <w:cantSplit/>
@@ -5541,7 +5656,7 @@
             <w:r>
               <w:drawing>
                 <wp:inline distT="0" distB="0" distL="0" distR="0">
-                  <wp:extent cx="2000250" cy="3000375"/>
+                  <wp:extent cx="2333625" cy="3505200"/>
                   <wp:effectExtent t="0" r="0" b="0" l="0"/>
                   <wp:docPr id="13" name="F13" descr="Plano Fadesa «Extintor rodante 100kg R1» (código B208/214/237/238/239/243/244/245)" title="F13"/>
                   <wp:cNvGraphicFramePr>
@@ -5566,7 +5681,7 @@
                         <pic:spPr bwMode="auto">
                           <a:xfrm>
                             <a:off x="0" y="0"/>
-                            <a:ext cx="2000250" cy="3000375"/>
+                            <a:ext cx="2333625" cy="3505200"/>
                           </a:xfrm>
                           <a:prstGeom prst="rect">
                             <a:avLst/>
@@ -5730,6 +5845,11 @@
         </w:tc>
       </w:tr>
     </w:tbl>
+    <w:p>
+      <w:pPr>
+        <w:spacing w:after="0" w:before="0" w:line="20" w:lineRule="exact"/>
+      </w:pPr>
+    </w:p>
     <w:p>
       <w:pPr>
         <w:pStyle w:val="Heading1"/>
@@ -5830,7 +5950,7 @@
             <w:r>
               <w:drawing>
                 <wp:inline distT="0" distB="0" distL="0" distR="0">
-                  <wp:extent cx="3143250" cy="1743075"/>
+                  <wp:extent cx="2809875" cy="1552575"/>
                   <wp:effectExtent t="0" r="0" b="0" l="0"/>
                   <wp:docPr id="14" name="F14" descr="Catálogo Fadesa 3, pág. 4: tabla «Especificaciones»" title="F14"/>
                   <wp:cNvGraphicFramePr>
@@ -5855,7 +5975,7 @@
                         <pic:spPr bwMode="auto">
                           <a:xfrm>
                             <a:off x="0" y="0"/>
-                            <a:ext cx="3143250" cy="1743075"/>
+                            <a:ext cx="2809875" cy="1552575"/>
                           </a:xfrm>
                           <a:prstGeom prst="rect">
                             <a:avLst/>
@@ -6091,7 +6211,7 @@
             <w:r>
               <w:drawing>
                 <wp:inline distT="0" distB="0" distL="0" distR="0">
-                  <wp:extent cx="3143250" cy="1743075"/>
+                  <wp:extent cx="2809875" cy="1552575"/>
                   <wp:effectExtent t="0" r="0" b="0" l="0"/>
                   <wp:docPr id="15" name="F15" descr="Catálogo Fadesa 3, pág. 5: tabla «Especificaciones»" title="F15"/>
                   <wp:cNvGraphicFramePr>
@@ -6116,7 +6236,7 @@
                         <pic:spPr bwMode="auto">
                           <a:xfrm>
                             <a:off x="0" y="0"/>
-                            <a:ext cx="3143250" cy="1743075"/>
+                            <a:ext cx="2809875" cy="1552575"/>
                           </a:xfrm>
                           <a:prstGeom prst="rect">
                             <a:avLst/>
@@ -6302,6 +6422,28 @@
           </w:p>
         </w:tc>
       </w:tr>
+    </w:tbl>
+    <w:p>
+      <w:pPr>
+        <w:spacing w:after="0" w:before="0" w:line="20" w:lineRule="exact"/>
+      </w:pPr>
+    </w:p>
+    <w:tbl>
+      <w:tblPr>
+        <w:tblW w:type="dxa" w:w="10306"/>
+        <w:tblBorders>
+          <w:top w:val="none" w:color="FFFFFF" w:sz="0"/>
+          <w:left w:val="none" w:color="FFFFFF" w:sz="0"/>
+          <w:bottom w:val="none" w:color="FFFFFF" w:sz="0"/>
+          <w:right w:val="none" w:color="FFFFFF" w:sz="0"/>
+          <w:insideH w:val="none" w:color="FFFFFF" w:sz="0"/>
+          <w:insideV w:val="none" w:color="FFFFFF" w:sz="0"/>
+        </w:tblBorders>
+      </w:tblPr>
+      <w:tblGrid>
+        <w:gridCol w:w="5153"/>
+        <w:gridCol w:w="5153"/>
+      </w:tblGrid>
       <w:tr>
         <w:trPr>
           <w:cantSplit/>
@@ -6357,7 +6499,7 @@
             <w:r>
               <w:drawing>
                 <wp:inline distT="0" distB="0" distL="0" distR="0">
-                  <wp:extent cx="3143250" cy="1743075"/>
+                  <wp:extent cx="2809875" cy="1552575"/>
                   <wp:effectExtent t="0" r="0" b="0" l="0"/>
                   <wp:docPr id="16" name="F16" descr="Catálogo Fadesa 3, pág. 6: tabla «Especificaciones»" title="F16"/>
                   <wp:cNvGraphicFramePr>
@@ -6382,7 +6524,7 @@
                         <pic:spPr bwMode="auto">
                           <a:xfrm>
                             <a:off x="0" y="0"/>
-                            <a:ext cx="3143250" cy="1743075"/>
+                            <a:ext cx="2809875" cy="1552575"/>
                           </a:xfrm>
                           <a:prstGeom prst="rect">
                             <a:avLst/>
@@ -6504,7 +6646,7 @@
             <w:r>
               <w:drawing>
                 <wp:inline distT="0" distB="0" distL="0" distR="0">
-                  <wp:extent cx="3143250" cy="1743075"/>
+                  <wp:extent cx="2809875" cy="1552575"/>
                   <wp:effectExtent t="0" r="0" b="0" l="0"/>
                   <wp:docPr id="17" name="F17" descr="Catálogo Fadesa 3, pág. 8: tabla «Especificaciones»" title="F17"/>
                   <wp:cNvGraphicFramePr>
@@ -6529,7 +6671,7 @@
                         <pic:spPr bwMode="auto">
                           <a:xfrm>
                             <a:off x="0" y="0"/>
-                            <a:ext cx="3143250" cy="1743075"/>
+                            <a:ext cx="2809875" cy="1552575"/>
                           </a:xfrm>
                           <a:prstGeom prst="rect">
                             <a:avLst/>
@@ -6617,6 +6759,28 @@
           </w:p>
         </w:tc>
       </w:tr>
+    </w:tbl>
+    <w:p>
+      <w:pPr>
+        <w:spacing w:after="0" w:before="0" w:line="20" w:lineRule="exact"/>
+      </w:pPr>
+    </w:p>
+    <w:tbl>
+      <w:tblPr>
+        <w:tblW w:type="dxa" w:w="10306"/>
+        <w:tblBorders>
+          <w:top w:val="none" w:color="FFFFFF" w:sz="0"/>
+          <w:left w:val="none" w:color="FFFFFF" w:sz="0"/>
+          <w:bottom w:val="none" w:color="FFFFFF" w:sz="0"/>
+          <w:right w:val="none" w:color="FFFFFF" w:sz="0"/>
+          <w:insideH w:val="none" w:color="FFFFFF" w:sz="0"/>
+          <w:insideV w:val="none" w:color="FFFFFF" w:sz="0"/>
+        </w:tblBorders>
+      </w:tblPr>
+      <w:tblGrid>
+        <w:gridCol w:w="5153"/>
+        <w:gridCol w:w="5153"/>
+      </w:tblGrid>
       <w:tr>
         <w:trPr>
           <w:cantSplit/>
@@ -6672,7 +6836,7 @@
             <w:r>
               <w:drawing>
                 <wp:inline distT="0" distB="0" distL="0" distR="0">
-                  <wp:extent cx="3143250" cy="1743075"/>
+                  <wp:extent cx="2809875" cy="1552575"/>
                   <wp:effectExtent t="0" r="0" b="0" l="0"/>
                   <wp:docPr id="18" name="F18" descr="Catálogo Fadesa 3, pág. 10: tabla «Especificaciones»" title="F18"/>
                   <wp:cNvGraphicFramePr>
@@ -6697,7 +6861,7 @@
                         <pic:spPr bwMode="auto">
                           <a:xfrm>
                             <a:off x="0" y="0"/>
-                            <a:ext cx="3143250" cy="1743075"/>
+                            <a:ext cx="2809875" cy="1552575"/>
                           </a:xfrm>
                           <a:prstGeom prst="rect">
                             <a:avLst/>
@@ -6835,7 +6999,7 @@
             <w:r>
               <w:drawing>
                 <wp:inline distT="0" distB="0" distL="0" distR="0">
-                  <wp:extent cx="3143250" cy="1743075"/>
+                  <wp:extent cx="2809875" cy="1552575"/>
                   <wp:effectExtent t="0" r="0" b="0" l="0"/>
                   <wp:docPr id="19" name="F19" descr="Catálogo Fadesa 3, pág. 11: tabla «Especificaciones»" title="F19"/>
                   <wp:cNvGraphicFramePr>
@@ -6860,7 +7024,7 @@
                         <pic:spPr bwMode="auto">
                           <a:xfrm>
                             <a:off x="0" y="0"/>
-                            <a:ext cx="3143250" cy="1743075"/>
+                            <a:ext cx="2809875" cy="1552575"/>
                           </a:xfrm>
                           <a:prstGeom prst="rect">
                             <a:avLst/>
@@ -6932,6 +7096,28 @@
           </w:p>
         </w:tc>
       </w:tr>
+    </w:tbl>
+    <w:p>
+      <w:pPr>
+        <w:spacing w:after="0" w:before="0" w:line="20" w:lineRule="exact"/>
+      </w:pPr>
+    </w:p>
+    <w:tbl>
+      <w:tblPr>
+        <w:tblW w:type="dxa" w:w="10306"/>
+        <w:tblBorders>
+          <w:top w:val="none" w:color="FFFFFF" w:sz="0"/>
+          <w:left w:val="none" w:color="FFFFFF" w:sz="0"/>
+          <w:bottom w:val="none" w:color="FFFFFF" w:sz="0"/>
+          <w:right w:val="none" w:color="FFFFFF" w:sz="0"/>
+          <w:insideH w:val="none" w:color="FFFFFF" w:sz="0"/>
+          <w:insideV w:val="none" w:color="FFFFFF" w:sz="0"/>
+        </w:tblBorders>
+      </w:tblPr>
+      <w:tblGrid>
+        <w:gridCol w:w="5153"/>
+        <w:gridCol w:w="5153"/>
+      </w:tblGrid>
       <w:tr>
         <w:trPr>
           <w:cantSplit/>
@@ -6987,7 +7173,7 @@
             <w:r>
               <w:drawing>
                 <wp:inline distT="0" distB="0" distL="0" distR="0">
-                  <wp:extent cx="3143250" cy="1743075"/>
+                  <wp:extent cx="2809875" cy="1552575"/>
                   <wp:effectExtent t="0" r="0" b="0" l="0"/>
                   <wp:docPr id="20" name="F20" descr="Catálogo Fadesa 3, pág. 13: tabla «Especificaciones»" title="F20"/>
                   <wp:cNvGraphicFramePr>
@@ -7012,7 +7198,7 @@
                         <pic:spPr bwMode="auto">
                           <a:xfrm>
                             <a:off x="0" y="0"/>
-                            <a:ext cx="3143250" cy="1743075"/>
+                            <a:ext cx="2809875" cy="1552575"/>
                           </a:xfrm>
                           <a:prstGeom prst="rect">
                             <a:avLst/>
@@ -7150,7 +7336,7 @@
             <w:r>
               <w:drawing>
                 <wp:inline distT="0" distB="0" distL="0" distR="0">
-                  <wp:extent cx="3143250" cy="1743075"/>
+                  <wp:extent cx="2809875" cy="1552575"/>
                   <wp:effectExtent t="0" r="0" b="0" l="0"/>
                   <wp:docPr id="21" name="F21" descr="Catálogo Fadesa 3, pág. 15: tabla «Especificaciones»" title="F21"/>
                   <wp:cNvGraphicFramePr>
@@ -7175,7 +7361,7 @@
                         <pic:spPr bwMode="auto">
                           <a:xfrm>
                             <a:off x="0" y="0"/>
-                            <a:ext cx="3143250" cy="1743075"/>
+                            <a:ext cx="2809875" cy="1552575"/>
                           </a:xfrm>
                           <a:prstGeom prst="rect">
                             <a:avLst/>
@@ -7247,6 +7433,28 @@
           </w:p>
         </w:tc>
       </w:tr>
+    </w:tbl>
+    <w:p>
+      <w:pPr>
+        <w:spacing w:after="0" w:before="0" w:line="20" w:lineRule="exact"/>
+      </w:pPr>
+    </w:p>
+    <w:tbl>
+      <w:tblPr>
+        <w:tblW w:type="dxa" w:w="10306"/>
+        <w:tblBorders>
+          <w:top w:val="none" w:color="FFFFFF" w:sz="0"/>
+          <w:left w:val="none" w:color="FFFFFF" w:sz="0"/>
+          <w:bottom w:val="none" w:color="FFFFFF" w:sz="0"/>
+          <w:right w:val="none" w:color="FFFFFF" w:sz="0"/>
+          <w:insideH w:val="none" w:color="FFFFFF" w:sz="0"/>
+          <w:insideV w:val="none" w:color="FFFFFF" w:sz="0"/>
+        </w:tblBorders>
+      </w:tblPr>
+      <w:tblGrid>
+        <w:gridCol w:w="5153"/>
+        <w:gridCol w:w="5153"/>
+      </w:tblGrid>
       <w:tr>
         <w:trPr>
           <w:cantSplit/>
@@ -7302,7 +7510,7 @@
             <w:r>
               <w:drawing>
                 <wp:inline distT="0" distB="0" distL="0" distR="0">
-                  <wp:extent cx="3143250" cy="1743075"/>
+                  <wp:extent cx="2324100" cy="1285875"/>
                   <wp:effectExtent t="0" r="0" b="0" l="0"/>
                   <wp:docPr id="22" name="F22" descr="Catálogo Fadesa 3, pág. 16: tabla «Especificaciones»" title="F22"/>
                   <wp:cNvGraphicFramePr>
@@ -7327,7 +7535,7 @@
                         <pic:spPr bwMode="auto">
                           <a:xfrm>
                             <a:off x="0" y="0"/>
-                            <a:ext cx="3143250" cy="1743075"/>
+                            <a:ext cx="2324100" cy="1285875"/>
                           </a:xfrm>
                           <a:prstGeom prst="rect">
                             <a:avLst/>
@@ -7487,7 +7695,7 @@
             <w:r>
               <w:drawing>
                 <wp:inline distT="0" distB="0" distL="0" distR="0">
-                  <wp:extent cx="3143250" cy="1743075"/>
+                  <wp:extent cx="2324100" cy="1285875"/>
                   <wp:effectExtent t="0" r="0" b="0" l="0"/>
                   <wp:docPr id="23" name="F23" descr="Catálogo Fadesa 3, pág. 17: tabla «Especificaciones»" title="F23"/>
                   <wp:cNvGraphicFramePr>
@@ -7512,7 +7720,7 @@
                         <pic:spPr bwMode="auto">
                           <a:xfrm>
                             <a:off x="0" y="0"/>
-                            <a:ext cx="3143250" cy="1743075"/>
+                            <a:ext cx="2324100" cy="1285875"/>
                           </a:xfrm>
                           <a:prstGeom prst="rect">
                             <a:avLst/>
@@ -7601,6 +7809,11 @@
         </w:tc>
       </w:tr>
     </w:tbl>
+    <w:p>
+      <w:pPr>
+        <w:spacing w:after="0" w:before="0" w:line="20" w:lineRule="exact"/>
+      </w:pPr>
+    </w:p>
     <w:p>
       <w:pPr>
         <w:pStyle w:val="Heading1"/>
@@ -7701,7 +7914,7 @@
             <w:r>
               <w:drawing>
                 <wp:inline distT="0" distB="0" distL="0" distR="0">
-                  <wp:extent cx="2505075" cy="2381250"/>
+                  <wp:extent cx="1847850" cy="1762125"/>
                   <wp:effectExtent t="0" r="0" b="0" l="0"/>
                   <wp:docPr id="24" name="F24" descr="Ficha técnica Georgia ABC 90 — 70 kg" title="F24"/>
                   <wp:cNvGraphicFramePr>
@@ -7726,7 +7939,7 @@
                         <pic:spPr bwMode="auto">
                           <a:xfrm>
                             <a:off x="0" y="0"/>
-                            <a:ext cx="2505075" cy="2381250"/>
+                            <a:ext cx="1847850" cy="1762125"/>
                           </a:xfrm>
                           <a:prstGeom prst="rect">
                             <a:avLst/>
@@ -7864,7 +8077,7 @@
             <w:r>
               <w:drawing>
                 <wp:inline distT="0" distB="0" distL="0" distR="0">
-                  <wp:extent cx="3143250" cy="762000"/>
+                  <wp:extent cx="2324100" cy="561975"/>
                   <wp:effectExtent t="0" r="0" b="0" l="0"/>
                   <wp:docPr id="25" name="F25" descr="Ficha técnica Melisam — acetato de potasio 6 L" title="F25"/>
                   <wp:cNvGraphicFramePr>
@@ -7889,7 +8102,7 @@
                         <pic:spPr bwMode="auto">
                           <a:xfrm>
                             <a:off x="0" y="0"/>
-                            <a:ext cx="3143250" cy="762000"/>
+                            <a:ext cx="2324100" cy="561975"/>
                           </a:xfrm>
                           <a:prstGeom prst="rect">
                             <a:avLst/>
@@ -7942,6 +8155,28 @@
           </w:p>
         </w:tc>
       </w:tr>
+    </w:tbl>
+    <w:p>
+      <w:pPr>
+        <w:spacing w:after="0" w:before="0" w:line="20" w:lineRule="exact"/>
+      </w:pPr>
+    </w:p>
+    <w:tbl>
+      <w:tblPr>
+        <w:tblW w:type="dxa" w:w="10306"/>
+        <w:tblBorders>
+          <w:top w:val="none" w:color="FFFFFF" w:sz="0"/>
+          <w:left w:val="none" w:color="FFFFFF" w:sz="0"/>
+          <w:bottom w:val="none" w:color="FFFFFF" w:sz="0"/>
+          <w:right w:val="none" w:color="FFFFFF" w:sz="0"/>
+          <w:insideH w:val="none" w:color="FFFFFF" w:sz="0"/>
+          <w:insideV w:val="none" w:color="FFFFFF" w:sz="0"/>
+        </w:tblBorders>
+      </w:tblPr>
+      <w:tblGrid>
+        <w:gridCol w:w="5153"/>
+        <w:gridCol w:w="5153"/>
+      </w:tblGrid>
       <w:tr>
         <w:trPr>
           <w:cantSplit/>
@@ -7997,7 +8232,7 @@
             <w:r>
               <w:drawing>
                 <wp:inline distT="0" distB="0" distL="0" distR="0">
-                  <wp:extent cx="3143250" cy="447675"/>
+                  <wp:extent cx="2324100" cy="333375"/>
                   <wp:effectExtent t="0" r="0" b="0" l="0"/>
                   <wp:docPr id="26" name="F26" descr="IRAM 3550:1981, cláusula 4.1.3.2 (espesor mínimo del recipiente)" title="F26"/>
                   <wp:cNvGraphicFramePr>
@@ -8022,7 +8257,7 @@
                         <pic:spPr bwMode="auto">
                           <a:xfrm>
                             <a:off x="0" y="0"/>
-                            <a:ext cx="3143250" cy="447675"/>
+                            <a:ext cx="2324100" cy="333375"/>
                           </a:xfrm>
                           <a:prstGeom prst="rect">
                             <a:avLst/>
@@ -8125,7 +8360,7 @@
             <w:r>
               <w:drawing>
                 <wp:inline distT="0" distB="0" distL="0" distR="0">
-                  <wp:extent cx="3143250" cy="257175"/>
+                  <wp:extent cx="2324100" cy="190500"/>
                   <wp:effectExtent t="0" r="0" b="0" l="0"/>
                   <wp:docPr id="27" name="F27" descr="IRAM 3534:1983, apartado 2.2.4.3 d) (longitud de la leyenda: arco de 108°)" title="F27"/>
                   <wp:cNvGraphicFramePr>
@@ -8150,7 +8385,7 @@
                         <pic:spPr bwMode="auto">
                           <a:xfrm>
                             <a:off x="0" y="0"/>
-                            <a:ext cx="3143250" cy="257175"/>
+                            <a:ext cx="2324100" cy="190500"/>
                           </a:xfrm>
                           <a:prstGeom prst="rect">
                             <a:avLst/>
@@ -8203,6 +8438,28 @@
           </w:p>
         </w:tc>
       </w:tr>
+    </w:tbl>
+    <w:p>
+      <w:pPr>
+        <w:spacing w:after="0" w:before="0" w:line="20" w:lineRule="exact"/>
+      </w:pPr>
+    </w:p>
+    <w:tbl>
+      <w:tblPr>
+        <w:tblW w:type="dxa" w:w="10306"/>
+        <w:tblBorders>
+          <w:top w:val="none" w:color="FFFFFF" w:sz="0"/>
+          <w:left w:val="none" w:color="FFFFFF" w:sz="0"/>
+          <w:bottom w:val="none" w:color="FFFFFF" w:sz="0"/>
+          <w:right w:val="none" w:color="FFFFFF" w:sz="0"/>
+          <w:insideH w:val="none" w:color="FFFFFF" w:sz="0"/>
+          <w:insideV w:val="none" w:color="FFFFFF" w:sz="0"/>
+        </w:tblBorders>
+      </w:tblPr>
+      <w:tblGrid>
+        <w:gridCol w:w="5153"/>
+        <w:gridCol w:w="5153"/>
+      </w:tblGrid>
       <w:tr>
         <w:trPr>
           <w:cantSplit/>
@@ -8258,7 +8515,7 @@
             <w:r>
               <w:drawing>
                 <wp:inline distT="0" distB="0" distL="0" distR="0">
-                  <wp:extent cx="3143250" cy="352425"/>
+                  <wp:extent cx="2324100" cy="257175"/>
                   <wp:effectExtent t="0" r="0" b="0" l="0"/>
                   <wp:docPr id="28" name="F28" descr="IRAM 3525:1983, apartado 3.2.1 b) (espesor mínimo del recipiente inoxidable)" title="F28"/>
                   <wp:cNvGraphicFramePr>
@@ -8283,7 +8540,7 @@
                         <pic:spPr bwMode="auto">
                           <a:xfrm>
                             <a:off x="0" y="0"/>
-                            <a:ext cx="3143250" cy="352425"/>
+                            <a:ext cx="2324100" cy="257175"/>
                           </a:xfrm>
                           <a:prstGeom prst="rect">
                             <a:avLst/>
@@ -8386,7 +8643,7 @@
             <w:r>
               <w:drawing>
                 <wp:inline distT="0" distB="0" distL="0" distR="0">
-                  <wp:extent cx="3143250" cy="838200"/>
+                  <wp:extent cx="2324100" cy="619125"/>
                   <wp:effectExtent t="0" r="0" b="0" l="0"/>
                   <wp:docPr id="29" name="F29" descr="Res. OPDS 522/07, Anexo 2 (oblea de fabricación de extintores de más de 1 kg)" title="F29"/>
                   <wp:cNvGraphicFramePr>
@@ -8411,7 +8668,7 @@
                         <pic:spPr bwMode="auto">
                           <a:xfrm>
                             <a:off x="0" y="0"/>
-                            <a:ext cx="3143250" cy="838200"/>
+                            <a:ext cx="2324100" cy="619125"/>
                           </a:xfrm>
                           <a:prstGeom prst="rect">
                             <a:avLst/>
@@ -8518,6 +8775,28 @@
           </w:p>
         </w:tc>
       </w:tr>
+    </w:tbl>
+    <w:p>
+      <w:pPr>
+        <w:spacing w:after="0" w:before="0" w:line="20" w:lineRule="exact"/>
+      </w:pPr>
+    </w:p>
+    <w:tbl>
+      <w:tblPr>
+        <w:tblW w:type="dxa" w:w="10306"/>
+        <w:tblBorders>
+          <w:top w:val="none" w:color="FFFFFF" w:sz="0"/>
+          <w:left w:val="none" w:color="FFFFFF" w:sz="0"/>
+          <w:bottom w:val="none" w:color="FFFFFF" w:sz="0"/>
+          <w:right w:val="none" w:color="FFFFFF" w:sz="0"/>
+          <w:insideH w:val="none" w:color="FFFFFF" w:sz="0"/>
+          <w:insideV w:val="none" w:color="FFFFFF" w:sz="0"/>
+        </w:tblBorders>
+      </w:tblPr>
+      <w:tblGrid>
+        <w:gridCol w:w="5153"/>
+        <w:gridCol w:w="5153"/>
+      </w:tblGrid>
       <w:tr>
         <w:trPr>
           <w:cantSplit/>
@@ -8573,7 +8852,7 @@
             <w:r>
               <w:drawing>
                 <wp:inline distT="0" distB="0" distL="0" distR="0">
-                  <wp:extent cx="3143250" cy="1762125"/>
+                  <wp:extent cx="2324100" cy="1304925"/>
                   <wp:effectExtent t="0" r="0" b="0" l="0"/>
                   <wp:docPr id="30" name="F30" descr="IRAM Anexo R — estampilla de conformidad de extintor nuevo" title="F30"/>
                   <wp:cNvGraphicFramePr>
@@ -8598,7 +8877,7 @@
                         <pic:spPr bwMode="auto">
                           <a:xfrm>
                             <a:off x="0" y="0"/>
-                            <a:ext cx="3143250" cy="1762125"/>
+                            <a:ext cx="2324100" cy="1304925"/>
                           </a:xfrm>
                           <a:prstGeom prst="rect">
                             <a:avLst/>
@@ -8720,7 +8999,7 @@
             <w:r>
               <w:drawing>
                 <wp:inline distT="0" distB="0" distL="0" distR="0">
-                  <wp:extent cx="3143250" cy="1247775"/>
+                  <wp:extent cx="2324100" cy="923925"/>
                   <wp:effectExtent t="0" r="0" b="0" l="0"/>
                   <wp:docPr id="31" name="F40" descr="IRAM 3550:1981, 4.8.2 tabla III (medidas del tren de rodaje)" title="F40"/>
                   <wp:cNvGraphicFramePr>
@@ -8745,7 +9024,7 @@
                         <pic:spPr bwMode="auto">
                           <a:xfrm>
                             <a:off x="0" y="0"/>
-                            <a:ext cx="3143250" cy="1247775"/>
+                            <a:ext cx="2324100" cy="923925"/>
                           </a:xfrm>
                           <a:prstGeom prst="rect">
                             <a:avLst/>
@@ -8799,6 +9078,11 @@
         </w:tc>
       </w:tr>
     </w:tbl>
+    <w:p>
+      <w:pPr>
+        <w:spacing w:after="0" w:before="0" w:line="20" w:lineRule="exact"/>
+      </w:pPr>
+    </w:p>
     <w:p>
       <w:pPr>
         <w:pStyle w:val="Heading1"/>
@@ -8899,7 +9183,7 @@
             <w:r>
               <w:drawing>
                 <wp:inline distT="0" distB="0" distL="0" distR="0">
-                  <wp:extent cx="1676400" cy="2238375"/>
+                  <wp:extent cx="1524000" cy="2038350"/>
                   <wp:effectExtent t="0" r="0" b="0" l="0"/>
                   <wp:docPr id="32" name="F31" descr="Relevamiento: tarjeta AGC (CABA) en un extintor de 10 kg" title="F31"/>
                   <wp:cNvGraphicFramePr>
@@ -8924,7 +9208,7 @@
                         <pic:spPr bwMode="auto">
                           <a:xfrm>
                             <a:off x="0" y="0"/>
-                            <a:ext cx="1676400" cy="2238375"/>
+                            <a:ext cx="1524000" cy="2038350"/>
                           </a:xfrm>
                           <a:prstGeom prst="rect">
                             <a:avLst/>
@@ -9043,7 +9327,7 @@
             <w:r>
               <w:drawing>
                 <wp:inline distT="0" distB="0" distL="0" distR="0">
-                  <wp:extent cx="1257300" cy="2238375"/>
+                  <wp:extent cx="1143000" cy="2038350"/>
                   <wp:effectExtent t="0" r="0" b="0" l="0"/>
                   <wp:docPr id="33" name="F32" descr="Relevamiento: etiqueta envolvente y estampilla IRAM (línea Georgia)" title="F32"/>
                   <wp:cNvGraphicFramePr>
@@ -9068,7 +9352,7 @@
                         <pic:spPr bwMode="auto">
                           <a:xfrm>
                             <a:off x="0" y="0"/>
-                            <a:ext cx="1257300" cy="2238375"/>
+                            <a:ext cx="1143000" cy="2038350"/>
                           </a:xfrm>
                           <a:prstGeom prst="rect">
                             <a:avLst/>
@@ -9156,6 +9440,28 @@
           </w:p>
         </w:tc>
       </w:tr>
+    </w:tbl>
+    <w:p>
+      <w:pPr>
+        <w:spacing w:after="0" w:before="0" w:line="20" w:lineRule="exact"/>
+      </w:pPr>
+    </w:p>
+    <w:tbl>
+      <w:tblPr>
+        <w:tblW w:type="dxa" w:w="10306"/>
+        <w:tblBorders>
+          <w:top w:val="none" w:color="FFFFFF" w:sz="0"/>
+          <w:left w:val="none" w:color="FFFFFF" w:sz="0"/>
+          <w:bottom w:val="none" w:color="FFFFFF" w:sz="0"/>
+          <w:right w:val="none" w:color="FFFFFF" w:sz="0"/>
+          <w:insideH w:val="none" w:color="FFFFFF" w:sz="0"/>
+          <w:insideV w:val="none" w:color="FFFFFF" w:sz="0"/>
+        </w:tblBorders>
+      </w:tblPr>
+      <w:tblGrid>
+        <w:gridCol w:w="5153"/>
+        <w:gridCol w:w="5153"/>
+      </w:tblGrid>
       <w:tr>
         <w:trPr>
           <w:cantSplit/>
@@ -9211,7 +9517,7 @@
             <w:r>
               <w:drawing>
                 <wp:inline distT="0" distB="0" distL="0" distR="0">
-                  <wp:extent cx="1257300" cy="2238375"/>
+                  <wp:extent cx="1143000" cy="2038350"/>
                   <wp:effectExtent t="0" r="0" b="0" l="0"/>
                   <wp:docPr id="34" name="F33" descr="Relevamiento: etiqueta de n° de serie GS1 (línea Melisam)" title="F33"/>
                   <wp:cNvGraphicFramePr>
@@ -9236,7 +9542,7 @@
                         <pic:spPr bwMode="auto">
                           <a:xfrm>
                             <a:off x="0" y="0"/>
-                            <a:ext cx="1257300" cy="2238375"/>
+                            <a:ext cx="1143000" cy="2038350"/>
                           </a:xfrm>
                           <a:prstGeom prst="rect">
                             <a:avLst/>
@@ -9355,7 +9661,7 @@
             <w:r>
               <w:drawing>
                 <wp:inline distT="0" distB="0" distL="0" distR="0">
-                  <wp:extent cx="1257300" cy="2238375"/>
+                  <wp:extent cx="1143000" cy="2038350"/>
                   <wp:effectExtent t="0" r="0" b="0" l="0"/>
                   <wp:docPr id="35" name="F34" descr="Relevamiento: faja de garantía rayada (línea de etiquetado Georgia)" title="F34"/>
                   <wp:cNvGraphicFramePr>
@@ -9380,7 +9686,7 @@
                         <pic:spPr bwMode="auto">
                           <a:xfrm>
                             <a:off x="0" y="0"/>
-                            <a:ext cx="1257300" cy="2238375"/>
+                            <a:ext cx="1143000" cy="2038350"/>
                           </a:xfrm>
                           <a:prstGeom prst="rect">
                             <a:avLst/>
@@ -9449,6 +9755,28 @@
           </w:p>
         </w:tc>
       </w:tr>
+    </w:tbl>
+    <w:p>
+      <w:pPr>
+        <w:spacing w:after="0" w:before="0" w:line="20" w:lineRule="exact"/>
+      </w:pPr>
+    </w:p>
+    <w:tbl>
+      <w:tblPr>
+        <w:tblW w:type="dxa" w:w="10306"/>
+        <w:tblBorders>
+          <w:top w:val="none" w:color="FFFFFF" w:sz="0"/>
+          <w:left w:val="none" w:color="FFFFFF" w:sz="0"/>
+          <w:bottom w:val="none" w:color="FFFFFF" w:sz="0"/>
+          <w:right w:val="none" w:color="FFFFFF" w:sz="0"/>
+          <w:insideH w:val="none" w:color="FFFFFF" w:sz="0"/>
+          <w:insideV w:val="none" w:color="FFFFFF" w:sz="0"/>
+        </w:tblBorders>
+      </w:tblPr>
+      <w:tblGrid>
+        <w:gridCol w:w="5153"/>
+        <w:gridCol w:w="5153"/>
+      </w:tblGrid>
       <w:tr>
         <w:trPr>
           <w:cantSplit/>
@@ -9504,7 +9832,7 @@
             <w:r>
               <w:drawing>
                 <wp:inline distT="0" distB="0" distL="0" distR="0">
-                  <wp:extent cx="1257300" cy="2238375"/>
+                  <wp:extent cx="1143000" cy="2038350"/>
                   <wp:effectExtent t="0" r="0" b="0" l="0"/>
                   <wp:docPr id="36" name="F35" descr="Relevamiento: oblea circular PBA (DPS) aplicada" title="F35"/>
                   <wp:cNvGraphicFramePr>
@@ -9529,7 +9857,7 @@
                         <pic:spPr bwMode="auto">
                           <a:xfrm>
                             <a:off x="0" y="0"/>
-                            <a:ext cx="1257300" cy="2238375"/>
+                            <a:ext cx="1143000" cy="2038350"/>
                           </a:xfrm>
                           <a:prstGeom prst="rect">
                             <a:avLst/>
@@ -9632,7 +9960,7 @@
             <w:r>
               <w:drawing>
                 <wp:inline distT="0" distB="0" distL="0" distR="0">
-                  <wp:extent cx="3143250" cy="809625"/>
+                  <wp:extent cx="2857500" cy="733425"/>
                   <wp:effectExtent t="0" r="0" b="0" l="0"/>
                   <wp:docPr id="37" name="F36" descr="Planilla MP FLAMA — geometría del acero por recipiente" title="F36"/>
                   <wp:cNvGraphicFramePr>
@@ -9657,7 +9985,7 @@
                         <pic:spPr bwMode="auto">
                           <a:xfrm>
                             <a:off x="0" y="0"/>
-                            <a:ext cx="3143250" cy="809625"/>
+                            <a:ext cx="2857500" cy="733425"/>
                           </a:xfrm>
                           <a:prstGeom prst="rect">
                             <a:avLst/>
@@ -9802,6 +10130,28 @@
           </w:p>
         </w:tc>
       </w:tr>
+    </w:tbl>
+    <w:p>
+      <w:pPr>
+        <w:spacing w:after="0" w:before="0" w:line="20" w:lineRule="exact"/>
+      </w:pPr>
+    </w:p>
+    <w:tbl>
+      <w:tblPr>
+        <w:tblW w:type="dxa" w:w="10306"/>
+        <w:tblBorders>
+          <w:top w:val="none" w:color="FFFFFF" w:sz="0"/>
+          <w:left w:val="none" w:color="FFFFFF" w:sz="0"/>
+          <w:bottom w:val="none" w:color="FFFFFF" w:sz="0"/>
+          <w:right w:val="none" w:color="FFFFFF" w:sz="0"/>
+          <w:insideH w:val="none" w:color="FFFFFF" w:sz="0"/>
+          <w:insideV w:val="none" w:color="FFFFFF" w:sz="0"/>
+        </w:tblBorders>
+      </w:tblPr>
+      <w:tblGrid>
+        <w:gridCol w:w="5153"/>
+        <w:gridCol w:w="5153"/>
+      </w:tblGrid>
       <w:tr>
         <w:trPr>
           <w:cantSplit/>
@@ -9857,7 +10207,7 @@
             <w:r>
               <w:drawing>
                 <wp:inline distT="0" distB="0" distL="0" distR="0">
-                  <wp:extent cx="3143250" cy="504825"/>
+                  <wp:extent cx="2857500" cy="457200"/>
                   <wp:effectExtent t="0" r="0" b="0" l="0"/>
                   <wp:docPr id="38" name="F37" descr="Planilla MP FLAMA — MP-22 varilla de refuerzo" title="F37"/>
                   <wp:cNvGraphicFramePr>
@@ -9882,7 +10232,7 @@
                         <pic:spPr bwMode="auto">
                           <a:xfrm>
                             <a:off x="0" y="0"/>
-                            <a:ext cx="3143250" cy="504825"/>
+                            <a:ext cx="2857500" cy="457200"/>
                           </a:xfrm>
                           <a:prstGeom prst="rect">
                             <a:avLst/>
@@ -9973,6 +10323,11 @@
         </w:tc>
       </w:tr>
     </w:tbl>
+    <w:p>
+      <w:pPr>
+        <w:spacing w:after="0" w:before="0" w:line="20" w:lineRule="exact"/>
+      </w:pPr>
+    </w:p>
     <w:p>
       <w:pPr>
         <w:pStyle w:val="Heading1"/>
@@ -10523,6 +10878,11 @@
     </w:tbl>
     <w:p>
       <w:pPr>
+        <w:spacing w:after="0" w:before="0" w:line="20" w:lineRule="exact"/>
+      </w:pPr>
+    </w:p>
+    <w:p>
+      <w:pPr>
         <w:pStyle w:val="Heading1"/>
         <w:keepNext/>
         <w:spacing w:after="80" w:before="160"/>
@@ -10897,6 +11257,28 @@
           </w:p>
         </w:tc>
       </w:tr>
+    </w:tbl>
+    <w:p>
+      <w:pPr>
+        <w:spacing w:after="0" w:before="0" w:line="20" w:lineRule="exact"/>
+      </w:pPr>
+    </w:p>
+    <w:tbl>
+      <w:tblPr>
+        <w:tblW w:type="dxa" w:w="10306"/>
+        <w:tblBorders>
+          <w:top w:val="none" w:color="FFFFFF" w:sz="0"/>
+          <w:left w:val="none" w:color="FFFFFF" w:sz="0"/>
+          <w:bottom w:val="none" w:color="FFFFFF" w:sz="0"/>
+          <w:right w:val="none" w:color="FFFFFF" w:sz="0"/>
+          <w:insideH w:val="none" w:color="FFFFFF" w:sz="0"/>
+          <w:insideV w:val="none" w:color="FFFFFF" w:sz="0"/>
+        </w:tblBorders>
+      </w:tblPr>
+      <w:tblGrid>
+        <w:gridCol w:w="5153"/>
+        <w:gridCol w:w="5153"/>
+      </w:tblGrid>
       <w:tr>
         <w:trPr>
           <w:cantSplit/>
@@ -10952,7 +11334,7 @@
             <w:r>
               <w:drawing>
                 <wp:inline distT="0" distB="0" distL="0" distR="0">
-                  <wp:extent cx="3009900" cy="2238375"/>
+                  <wp:extent cx="2667000" cy="1981200"/>
                   <wp:effectExtent t="0" r="0" b="0" l="0"/>
                   <wp:docPr id="43" name="F43" descr="Carro Elisam marcado por el usuario: soldadura de la barra lateral" title="F43"/>
                   <wp:cNvGraphicFramePr>
@@ -10977,7 +11359,7 @@
                         <pic:spPr bwMode="auto">
                           <a:xfrm>
                             <a:off x="0" y="0"/>
-                            <a:ext cx="3009900" cy="2238375"/>
+                            <a:ext cx="2667000" cy="1981200"/>
                           </a:xfrm>
                           <a:prstGeom prst="rect">
                             <a:avLst/>
@@ -11096,7 +11478,7 @@
             <w:r>
               <w:drawing>
                 <wp:inline distT="0" distB="0" distL="0" distR="0">
-                  <wp:extent cx="2400300" cy="2238375"/>
+                  <wp:extent cx="2124075" cy="1981200"/>
                   <wp:effectExtent t="0" r="0" b="0" l="0"/>
                   <wp:docPr id="44" name="F44" descr="Carro AFFF marcado por el usuario: altura del doblez de 30°" title="F44"/>
                   <wp:cNvGraphicFramePr>
@@ -11121,7 +11503,7 @@
                         <pic:spPr bwMode="auto">
                           <a:xfrm>
                             <a:off x="0" y="0"/>
-                            <a:ext cx="2400300" cy="2238375"/>
+                            <a:ext cx="2124075" cy="1981200"/>
                           </a:xfrm>
                           <a:prstGeom prst="rect">
                             <a:avLst/>
@@ -11209,6 +11591,28 @@
           </w:p>
         </w:tc>
       </w:tr>
+    </w:tbl>
+    <w:p>
+      <w:pPr>
+        <w:spacing w:after="0" w:before="0" w:line="20" w:lineRule="exact"/>
+      </w:pPr>
+    </w:p>
+    <w:tbl>
+      <w:tblPr>
+        <w:tblW w:type="dxa" w:w="10306"/>
+        <w:tblBorders>
+          <w:top w:val="none" w:color="FFFFFF" w:sz="0"/>
+          <w:left w:val="none" w:color="FFFFFF" w:sz="0"/>
+          <w:bottom w:val="none" w:color="FFFFFF" w:sz="0"/>
+          <w:right w:val="none" w:color="FFFFFF" w:sz="0"/>
+          <w:insideH w:val="none" w:color="FFFFFF" w:sz="0"/>
+          <w:insideV w:val="none" w:color="FFFFFF" w:sz="0"/>
+        </w:tblBorders>
+      </w:tblPr>
+      <w:tblGrid>
+        <w:gridCol w:w="5153"/>
+        <w:gridCol w:w="5153"/>
+      </w:tblGrid>
       <w:tr>
         <w:trPr>
           <w:cantSplit/>
@@ -11264,7 +11668,7 @@
             <w:r>
               <w:drawing>
                 <wp:inline distT="0" distB="0" distL="0" distR="0">
-                  <wp:extent cx="2695575" cy="2238375"/>
+                  <wp:extent cx="2390775" cy="1981200"/>
                   <wp:effectExtent t="0" r="0" b="0" l="0"/>
                   <wp:docPr id="45" name="F45" descr="Lanza de carro con válvula esférica (foto del usuario)" title="F45"/>
                   <wp:cNvGraphicFramePr>
@@ -11289,7 +11693,7 @@
                         <pic:spPr bwMode="auto">
                           <a:xfrm>
                             <a:off x="0" y="0"/>
-                            <a:ext cx="2695575" cy="2238375"/>
+                            <a:ext cx="2390775" cy="1981200"/>
                           </a:xfrm>
                           <a:prstGeom prst="rect">
                             <a:avLst/>
@@ -11427,7 +11831,7 @@
             <w:r>
               <w:drawing>
                 <wp:inline distT="0" distB="0" distL="0" distR="0">
-                  <wp:extent cx="1695450" cy="2762250"/>
+                  <wp:extent cx="1504950" cy="2447925"/>
                   <wp:effectExtent t="0" r="0" b="0" l="0"/>
                   <wp:docPr id="46" name="F46" descr="Proceso de carros v2: dónde va cada accesorio (vista de costado, 50 kg)" title="F46"/>
                   <wp:cNvGraphicFramePr>
@@ -11452,7 +11856,7 @@
                         <pic:spPr bwMode="auto">
                           <a:xfrm>
                             <a:off x="0" y="0"/>
-                            <a:ext cx="1695450" cy="2762250"/>
+                            <a:ext cx="1504950" cy="2447925"/>
                           </a:xfrm>
                           <a:prstGeom prst="rect">
                             <a:avLst/>
@@ -11597,6 +12001,28 @@
           </w:p>
         </w:tc>
       </w:tr>
+    </w:tbl>
+    <w:p>
+      <w:pPr>
+        <w:spacing w:after="0" w:before="0" w:line="20" w:lineRule="exact"/>
+      </w:pPr>
+    </w:p>
+    <w:tbl>
+      <w:tblPr>
+        <w:tblW w:type="dxa" w:w="10306"/>
+        <w:tblBorders>
+          <w:top w:val="none" w:color="FFFFFF" w:sz="0"/>
+          <w:left w:val="none" w:color="FFFFFF" w:sz="0"/>
+          <w:bottom w:val="none" w:color="FFFFFF" w:sz="0"/>
+          <w:right w:val="none" w:color="FFFFFF" w:sz="0"/>
+          <w:insideH w:val="none" w:color="FFFFFF" w:sz="0"/>
+          <w:insideV w:val="none" w:color="FFFFFF" w:sz="0"/>
+        </w:tblBorders>
+      </w:tblPr>
+      <w:tblGrid>
+        <w:gridCol w:w="5153"/>
+        <w:gridCol w:w="5153"/>
+      </w:tblGrid>
       <w:tr>
         <w:trPr>
           <w:cantSplit/>
@@ -11652,7 +12078,7 @@
             <w:r>
               <w:drawing>
                 <wp:inline distT="0" distB="0" distL="0" distR="0">
-                  <wp:extent cx="3143250" cy="2438400"/>
+                  <wp:extent cx="2781300" cy="2162175"/>
                   <wp:effectExtent t="0" r="0" b="0" l="0"/>
                   <wp:docPr id="47" name="F47" descr="Proceso de carros v2: posiciones sobre el cuerpo desarrollado (50 kg)" title="F47"/>
                   <wp:cNvGraphicFramePr>
@@ -11677,7 +12103,7 @@
                         <pic:spPr bwMode="auto">
                           <a:xfrm>
                             <a:off x="0" y="0"/>
-                            <a:ext cx="3143250" cy="2438400"/>
+                            <a:ext cx="2781300" cy="2162175"/>
                           </a:xfrm>
                           <a:prstGeom prst="rect">
                             <a:avLst/>
@@ -11872,7 +12298,7 @@
             <w:r>
               <w:drawing>
                 <wp:inline distT="0" distB="0" distL="0" distR="0">
-                  <wp:extent cx="3143250" cy="1419225"/>
+                  <wp:extent cx="2781300" cy="1257300"/>
                   <wp:effectExtent t="0" r="0" b="0" l="0"/>
                   <wp:docPr id="48" name="F48" descr="Proceso de carros v2: piezas del kit (25 / 50 / 70 y 100 kg)" title="F48"/>
                   <wp:cNvGraphicFramePr>
@@ -11897,7 +12323,7 @@
                         <pic:spPr bwMode="auto">
                           <a:xfrm>
                             <a:off x="0" y="0"/>
-                            <a:ext cx="3143250" cy="1419225"/>
+                            <a:ext cx="2781300" cy="1257300"/>
                           </a:xfrm>
                           <a:prstGeom prst="rect">
                             <a:avLst/>
@@ -12042,6 +12468,28 @@
           </w:p>
         </w:tc>
       </w:tr>
+    </w:tbl>
+    <w:p>
+      <w:pPr>
+        <w:spacing w:after="0" w:before="0" w:line="20" w:lineRule="exact"/>
+      </w:pPr>
+    </w:p>
+    <w:tbl>
+      <w:tblPr>
+        <w:tblW w:type="dxa" w:w="10306"/>
+        <w:tblBorders>
+          <w:top w:val="none" w:color="FFFFFF" w:sz="0"/>
+          <w:left w:val="none" w:color="FFFFFF" w:sz="0"/>
+          <w:bottom w:val="none" w:color="FFFFFF" w:sz="0"/>
+          <w:right w:val="none" w:color="FFFFFF" w:sz="0"/>
+          <w:insideH w:val="none" w:color="FFFFFF" w:sz="0"/>
+          <w:insideV w:val="none" w:color="FFFFFF" w:sz="0"/>
+        </w:tblBorders>
+      </w:tblPr>
+      <w:tblGrid>
+        <w:gridCol w:w="5153"/>
+        <w:gridCol w:w="5153"/>
+      </w:tblGrid>
       <w:tr>
         <w:trPr>
           <w:cantSplit/>
@@ -12430,6 +12878,28 @@
           </w:p>
         </w:tc>
       </w:tr>
+    </w:tbl>
+    <w:p>
+      <w:pPr>
+        <w:spacing w:after="0" w:before="0" w:line="20" w:lineRule="exact"/>
+      </w:pPr>
+    </w:p>
+    <w:tbl>
+      <w:tblPr>
+        <w:tblW w:type="dxa" w:w="10306"/>
+        <w:tblBorders>
+          <w:top w:val="none" w:color="FFFFFF" w:sz="0"/>
+          <w:left w:val="none" w:color="FFFFFF" w:sz="0"/>
+          <w:bottom w:val="none" w:color="FFFFFF" w:sz="0"/>
+          <w:right w:val="none" w:color="FFFFFF" w:sz="0"/>
+          <w:insideH w:val="none" w:color="FFFFFF" w:sz="0"/>
+          <w:insideV w:val="none" w:color="FFFFFF" w:sz="0"/>
+        </w:tblBorders>
+      </w:tblPr>
+      <w:tblGrid>
+        <w:gridCol w:w="5153"/>
+        <w:gridCol w:w="5153"/>
+      </w:tblGrid>
       <w:tr>
         <w:trPr>
           <w:cantSplit/>
@@ -12838,6 +13308,11 @@
         </w:tc>
       </w:tr>
     </w:tbl>
+    <w:p>
+      <w:pPr>
+        <w:spacing w:after="0" w:before="0" w:line="20" w:lineRule="exact"/>
+      </w:pPr>
+    </w:p>
     <w:p>
       <w:pPr>
         <w:pStyle w:val="Heading1"/>
@@ -12889,21 +13364,6 @@
         <w:t xml:space="preserve">presiones de servicio / ensayo de la hoja de cada modelo (ABC manuales 1,4 / 3,5 MPa; rodantes 1,4 / 4,0; agua y espuma 0,8 / 2,0; CO₂ 15 / 25). Tensiones: virola σ = p·D / 2t; casquete elipsoidal con su factor de forma K; ejes y pasadores al corte doble; eje de rueda a flexión en voladizo. Materiales con su fluencia mínima: chapa del recipiente 265 MPa, SAE 1010 180, SAE 1045 trefilado 530, inoxidable 304 205 (σ0,2 de ASTM A240). CO₂ con su ecuación de estado (Span-Wagner). Precios: LAC USD 1,10/kg y lista HZ de válvulas.</w:t>
       </w:r>
     </w:p>
-    <w:p>
-      <w:pPr>
-        <w:pStyle w:val="Heading2"/>
-        <w:keepNext/>
-        <w:spacing w:after="80" w:before="140"/>
-      </w:pPr>
-      <w:r>
-        <w:rPr>
-          <w:rFonts w:ascii="Arial" w:cs="Arial" w:eastAsia="Arial" w:hAnsi="Arial"/>
-          <w:sz w:val="18"/>
-          <w:szCs w:val="18"/>
-        </w:rPr>
-        <w:t xml:space="preserve">A. Recipiente a presión</w:t>
-      </w:r>
-    </w:p>
     <w:tbl>
       <w:tblPr>
         <w:tblW w:type="dxa" w:w="10306"/>
@@ -12920,6 +13380,47 @@
         <w:gridCol w:w="2500"/>
         <w:gridCol w:w="7806"/>
       </w:tblGrid>
+      <w:tr>
+        <w:trPr>
+          <w:cantSplit/>
+          <w:tblHeader/>
+        </w:trPr>
+        <w:tc>
+          <w:tcPr>
+            <w:tcW w:type="dxa" w:w="10306"/>
+            <w:gridSpan w:val="2"/>
+            <w:tcBorders>
+              <w:top w:val="single" w:color="BFBFBF" w:sz="4"/>
+              <w:left w:val="single" w:color="BFBFBF" w:sz="4"/>
+              <w:bottom w:val="single" w:color="BFBFBF" w:sz="4"/>
+              <w:right w:val="single" w:color="BFBFBF" w:sz="4"/>
+            </w:tcBorders>
+            <w:shd w:fill="D9E2F3" w:color="auto" w:val="clear"/>
+            <w:tcMar>
+              <w:top w:type="dxa" w:w="40"/>
+              <w:left w:type="dxa" w:w="70"/>
+              <w:bottom w:type="dxa" w:w="40"/>
+              <w:right w:type="dxa" w:w="70"/>
+            </w:tcMar>
+          </w:tcPr>
+          <w:p>
+            <w:pPr>
+              <w:spacing w:after="0"/>
+            </w:pPr>
+            <w:r>
+              <w:rPr>
+                <w:rFonts w:ascii="Arial" w:cs="Arial" w:eastAsia="Arial" w:hAnsi="Arial"/>
+                <w:b/>
+                <w:bCs/>
+                <w:color w:val="1F3864"/>
+                <w:sz w:val="20"/>
+                <w:szCs w:val="20"/>
+              </w:rPr>
+              <w:t xml:space="preserve">A. Recipiente a presión</w:t>
+            </w:r>
+          </w:p>
+        </w:tc>
+      </w:tr>
       <w:tr>
         <w:trPr>
           <w:tblHeader/>
@@ -12995,7 +13496,7 @@
       </w:tr>
       <w:tr>
         <w:trPr>
-          <w:cantSplit/>
+          <w:cantSplit w:val="off"/>
         </w:trPr>
         <w:tc>
           <w:tcPr>
@@ -13203,7 +13704,7 @@
       </w:tr>
       <w:tr>
         <w:trPr>
-          <w:cantSplit/>
+          <w:cantSplit w:val="off"/>
         </w:trPr>
         <w:tc>
           <w:tcPr>
@@ -13387,7 +13888,7 @@
       </w:tr>
       <w:tr>
         <w:trPr>
-          <w:cantSplit/>
+          <w:cantSplit w:val="off"/>
         </w:trPr>
         <w:tc>
           <w:tcPr>
@@ -13595,7 +14096,7 @@
       </w:tr>
       <w:tr>
         <w:trPr>
-          <w:cantSplit/>
+          <w:cantSplit w:val="off"/>
         </w:trPr>
         <w:tc>
           <w:tcPr>
@@ -13779,7 +14280,7 @@
       </w:tr>
       <w:tr>
         <w:trPr>
-          <w:cantSplit/>
+          <w:cantSplit w:val="off"/>
         </w:trPr>
         <w:tc>
           <w:tcPr>
@@ -13963,7 +14464,7 @@
       </w:tr>
       <w:tr>
         <w:trPr>
-          <w:cantSplit/>
+          <w:cantSplit w:val="off"/>
         </w:trPr>
         <w:tc>
           <w:tcPr>
@@ -14171,7 +14672,7 @@
       </w:tr>
       <w:tr>
         <w:trPr>
-          <w:cantSplit/>
+          <w:cantSplit w:val="off"/>
         </w:trPr>
         <w:tc>
           <w:tcPr>
@@ -14379,7 +14880,7 @@
       </w:tr>
       <w:tr>
         <w:trPr>
-          <w:cantSplit/>
+          <w:cantSplit w:val="off"/>
         </w:trPr>
         <w:tc>
           <w:tcPr>
@@ -14563,7 +15064,7 @@
       </w:tr>
       <w:tr>
         <w:trPr>
-          <w:cantSplit/>
+          <w:cantSplit w:val="off"/>
         </w:trPr>
         <w:tc>
           <w:tcPr>
@@ -14748,9 +15249,7 @@
     </w:tbl>
     <w:p>
       <w:pPr>
-        <w:pStyle w:val="Heading2"/>
-        <w:keepNext/>
-        <w:spacing w:after="80" w:before="140"/>
+        <w:spacing w:after="100" w:before="0"/>
       </w:pPr>
       <w:r>
         <w:rPr>
@@ -14758,7 +15257,7 @@
           <w:sz w:val="18"/>
           <w:szCs w:val="18"/>
         </w:rPr>
-        <w:t xml:space="preserve">B. Válvula (se compra armada)</w:t>
+        <w:t xml:space="preserve"/>
       </w:r>
     </w:p>
     <w:tbl>
@@ -14777,6 +15276,47 @@
         <w:gridCol w:w="2500"/>
         <w:gridCol w:w="7806"/>
       </w:tblGrid>
+      <w:tr>
+        <w:trPr>
+          <w:cantSplit/>
+          <w:tblHeader/>
+        </w:trPr>
+        <w:tc>
+          <w:tcPr>
+            <w:tcW w:type="dxa" w:w="10306"/>
+            <w:gridSpan w:val="2"/>
+            <w:tcBorders>
+              <w:top w:val="single" w:color="BFBFBF" w:sz="4"/>
+              <w:left w:val="single" w:color="BFBFBF" w:sz="4"/>
+              <w:bottom w:val="single" w:color="BFBFBF" w:sz="4"/>
+              <w:right w:val="single" w:color="BFBFBF" w:sz="4"/>
+            </w:tcBorders>
+            <w:shd w:fill="D9E2F3" w:color="auto" w:val="clear"/>
+            <w:tcMar>
+              <w:top w:type="dxa" w:w="40"/>
+              <w:left w:type="dxa" w:w="70"/>
+              <w:bottom w:type="dxa" w:w="40"/>
+              <w:right w:type="dxa" w:w="70"/>
+            </w:tcMar>
+          </w:tcPr>
+          <w:p>
+            <w:pPr>
+              <w:spacing w:after="0"/>
+            </w:pPr>
+            <w:r>
+              <w:rPr>
+                <w:rFonts w:ascii="Arial" w:cs="Arial" w:eastAsia="Arial" w:hAnsi="Arial"/>
+                <w:b/>
+                <w:bCs/>
+                <w:color w:val="1F3864"/>
+                <w:sz w:val="20"/>
+                <w:szCs w:val="20"/>
+              </w:rPr>
+              <w:t xml:space="preserve">B. Válvula (se compra armada)</w:t>
+            </w:r>
+          </w:p>
+        </w:tc>
+      </w:tr>
       <w:tr>
         <w:trPr>
           <w:tblHeader/>
@@ -14852,7 +15392,7 @@
       </w:tr>
       <w:tr>
         <w:trPr>
-          <w:cantSplit/>
+          <w:cantSplit w:val="off"/>
         </w:trPr>
         <w:tc>
           <w:tcPr>
@@ -15060,7 +15600,7 @@
       </w:tr>
       <w:tr>
         <w:trPr>
-          <w:cantSplit/>
+          <w:cantSplit w:val="off"/>
         </w:trPr>
         <w:tc>
           <w:tcPr>
@@ -15268,7 +15808,7 @@
       </w:tr>
       <w:tr>
         <w:trPr>
-          <w:cantSplit/>
+          <w:cantSplit w:val="off"/>
         </w:trPr>
         <w:tc>
           <w:tcPr>
@@ -15452,7 +15992,7 @@
       </w:tr>
       <w:tr>
         <w:trPr>
-          <w:cantSplit/>
+          <w:cantSplit w:val="off"/>
         </w:trPr>
         <w:tc>
           <w:tcPr>
@@ -15636,7 +16176,7 @@
       </w:tr>
       <w:tr>
         <w:trPr>
-          <w:cantSplit/>
+          <w:cantSplit w:val="off"/>
         </w:trPr>
         <w:tc>
           <w:tcPr>
@@ -15820,7 +16360,7 @@
       </w:tr>
       <w:tr>
         <w:trPr>
-          <w:cantSplit/>
+          <w:cantSplit w:val="off"/>
         </w:trPr>
         <w:tc>
           <w:tcPr>
@@ -16004,7 +16544,7 @@
       </w:tr>
       <w:tr>
         <w:trPr>
-          <w:cantSplit/>
+          <w:cantSplit w:val="off"/>
         </w:trPr>
         <w:tc>
           <w:tcPr>
@@ -16189,9 +16729,7 @@
     </w:tbl>
     <w:p>
       <w:pPr>
-        <w:pStyle w:val="Heading2"/>
-        <w:keepNext/>
-        <w:spacing w:after="80" w:before="140"/>
+        <w:spacing w:after="100" w:before="0"/>
       </w:pPr>
       <w:r>
         <w:rPr>
@@ -16199,7 +16737,7 @@
           <w:sz w:val="18"/>
           <w:szCs w:val="18"/>
         </w:rPr>
-        <w:t xml:space="preserve">C. Descarga</w:t>
+        <w:t xml:space="preserve"/>
       </w:r>
     </w:p>
     <w:tbl>
@@ -16218,6 +16756,47 @@
         <w:gridCol w:w="2500"/>
         <w:gridCol w:w="7806"/>
       </w:tblGrid>
+      <w:tr>
+        <w:trPr>
+          <w:cantSplit/>
+          <w:tblHeader/>
+        </w:trPr>
+        <w:tc>
+          <w:tcPr>
+            <w:tcW w:type="dxa" w:w="10306"/>
+            <w:gridSpan w:val="2"/>
+            <w:tcBorders>
+              <w:top w:val="single" w:color="BFBFBF" w:sz="4"/>
+              <w:left w:val="single" w:color="BFBFBF" w:sz="4"/>
+              <w:bottom w:val="single" w:color="BFBFBF" w:sz="4"/>
+              <w:right w:val="single" w:color="BFBFBF" w:sz="4"/>
+            </w:tcBorders>
+            <w:shd w:fill="D9E2F3" w:color="auto" w:val="clear"/>
+            <w:tcMar>
+              <w:top w:type="dxa" w:w="40"/>
+              <w:left w:type="dxa" w:w="70"/>
+              <w:bottom w:type="dxa" w:w="40"/>
+              <w:right w:type="dxa" w:w="70"/>
+            </w:tcMar>
+          </w:tcPr>
+          <w:p>
+            <w:pPr>
+              <w:spacing w:after="0"/>
+            </w:pPr>
+            <w:r>
+              <w:rPr>
+                <w:rFonts w:ascii="Arial" w:cs="Arial" w:eastAsia="Arial" w:hAnsi="Arial"/>
+                <w:b/>
+                <w:bCs/>
+                <w:color w:val="1F3864"/>
+                <w:sz w:val="20"/>
+                <w:szCs w:val="20"/>
+              </w:rPr>
+              <w:t xml:space="preserve">C. Descarga</w:t>
+            </w:r>
+          </w:p>
+        </w:tc>
+      </w:tr>
       <w:tr>
         <w:trPr>
           <w:tblHeader/>
@@ -16293,7 +16872,7 @@
       </w:tr>
       <w:tr>
         <w:trPr>
-          <w:cantSplit/>
+          <w:cantSplit w:val="off"/>
         </w:trPr>
         <w:tc>
           <w:tcPr>
@@ -16501,7 +17080,7 @@
       </w:tr>
       <w:tr>
         <w:trPr>
-          <w:cantSplit/>
+          <w:cantSplit w:val="off"/>
         </w:trPr>
         <w:tc>
           <w:tcPr>
@@ -16685,7 +17264,7 @@
       </w:tr>
       <w:tr>
         <w:trPr>
-          <w:cantSplit/>
+          <w:cantSplit w:val="off"/>
         </w:trPr>
         <w:tc>
           <w:tcPr>
@@ -16869,7 +17448,7 @@
       </w:tr>
       <w:tr>
         <w:trPr>
-          <w:cantSplit/>
+          <w:cantSplit w:val="off"/>
         </w:trPr>
         <w:tc>
           <w:tcPr>
@@ -17053,7 +17632,7 @@
       </w:tr>
       <w:tr>
         <w:trPr>
-          <w:cantSplit/>
+          <w:cantSplit w:val="off"/>
         </w:trPr>
         <w:tc>
           <w:tcPr>
@@ -17237,7 +17816,7 @@
       </w:tr>
       <w:tr>
         <w:trPr>
-          <w:cantSplit/>
+          <w:cantSplit w:val="off"/>
         </w:trPr>
         <w:tc>
           <w:tcPr>
@@ -17421,7 +18000,7 @@
       </w:tr>
       <w:tr>
         <w:trPr>
-          <w:cantSplit/>
+          <w:cantSplit w:val="off"/>
         </w:trPr>
         <w:tc>
           <w:tcPr>
@@ -17605,7 +18184,7 @@
       </w:tr>
       <w:tr>
         <w:trPr>
-          <w:cantSplit/>
+          <w:cantSplit w:val="off"/>
         </w:trPr>
         <w:tc>
           <w:tcPr>
@@ -17789,7 +18368,7 @@
       </w:tr>
       <w:tr>
         <w:trPr>
-          <w:cantSplit/>
+          <w:cantSplit w:val="off"/>
         </w:trPr>
         <w:tc>
           <w:tcPr>
@@ -17973,7 +18552,7 @@
       </w:tr>
       <w:tr>
         <w:trPr>
-          <w:cantSplit/>
+          <w:cantSplit w:val="off"/>
         </w:trPr>
         <w:tc>
           <w:tcPr>
@@ -18158,9 +18737,7 @@
     </w:tbl>
     <w:p>
       <w:pPr>
-        <w:pStyle w:val="Heading2"/>
-        <w:keepNext/>
-        <w:spacing w:after="80" w:before="140"/>
+        <w:spacing w:after="100" w:before="0"/>
       </w:pPr>
       <w:r>
         <w:rPr>
@@ -18168,7 +18745,7 @@
           <w:sz w:val="18"/>
           <w:szCs w:val="18"/>
         </w:rPr>
-        <w:t xml:space="preserve">D. Tren de rodaje</w:t>
+        <w:t xml:space="preserve"/>
       </w:r>
     </w:p>
     <w:tbl>
@@ -18187,6 +18764,47 @@
         <w:gridCol w:w="2500"/>
         <w:gridCol w:w="7806"/>
       </w:tblGrid>
+      <w:tr>
+        <w:trPr>
+          <w:cantSplit/>
+          <w:tblHeader/>
+        </w:trPr>
+        <w:tc>
+          <w:tcPr>
+            <w:tcW w:type="dxa" w:w="10306"/>
+            <w:gridSpan w:val="2"/>
+            <w:tcBorders>
+              <w:top w:val="single" w:color="BFBFBF" w:sz="4"/>
+              <w:left w:val="single" w:color="BFBFBF" w:sz="4"/>
+              <w:bottom w:val="single" w:color="BFBFBF" w:sz="4"/>
+              <w:right w:val="single" w:color="BFBFBF" w:sz="4"/>
+            </w:tcBorders>
+            <w:shd w:fill="D9E2F3" w:color="auto" w:val="clear"/>
+            <w:tcMar>
+              <w:top w:type="dxa" w:w="40"/>
+              <w:left w:type="dxa" w:w="70"/>
+              <w:bottom w:type="dxa" w:w="40"/>
+              <w:right w:type="dxa" w:w="70"/>
+            </w:tcMar>
+          </w:tcPr>
+          <w:p>
+            <w:pPr>
+              <w:spacing w:after="0"/>
+            </w:pPr>
+            <w:r>
+              <w:rPr>
+                <w:rFonts w:ascii="Arial" w:cs="Arial" w:eastAsia="Arial" w:hAnsi="Arial"/>
+                <w:b/>
+                <w:bCs/>
+                <w:color w:val="1F3864"/>
+                <w:sz w:val="20"/>
+                <w:szCs w:val="20"/>
+              </w:rPr>
+              <w:t xml:space="preserve">D. Tren de rodaje</w:t>
+            </w:r>
+          </w:p>
+        </w:tc>
+      </w:tr>
       <w:tr>
         <w:trPr>
           <w:tblHeader/>
@@ -18262,7 +18880,7 @@
       </w:tr>
       <w:tr>
         <w:trPr>
-          <w:cantSplit/>
+          <w:cantSplit w:val="off"/>
         </w:trPr>
         <w:tc>
           <w:tcPr>
@@ -18470,7 +19088,7 @@
       </w:tr>
       <w:tr>
         <w:trPr>
-          <w:cantSplit/>
+          <w:cantSplit w:val="off"/>
         </w:trPr>
         <w:tc>
           <w:tcPr>
@@ -18654,7 +19272,7 @@
       </w:tr>
       <w:tr>
         <w:trPr>
-          <w:cantSplit/>
+          <w:cantSplit w:val="off"/>
         </w:trPr>
         <w:tc>
           <w:tcPr>
@@ -18838,7 +19456,7 @@
       </w:tr>
       <w:tr>
         <w:trPr>
-          <w:cantSplit/>
+          <w:cantSplit w:val="off"/>
         </w:trPr>
         <w:tc>
           <w:tcPr>
@@ -19046,7 +19664,7 @@
       </w:tr>
       <w:tr>
         <w:trPr>
-          <w:cantSplit/>
+          <w:cantSplit w:val="off"/>
         </w:trPr>
         <w:tc>
           <w:tcPr>
@@ -19230,7 +19848,7 @@
       </w:tr>
       <w:tr>
         <w:trPr>
-          <w:cantSplit/>
+          <w:cantSplit w:val="off"/>
         </w:trPr>
         <w:tc>
           <w:tcPr>
@@ -19415,9 +20033,7 @@
     </w:tbl>
     <w:p>
       <w:pPr>
-        <w:pStyle w:val="Heading2"/>
-        <w:keepNext/>
-        <w:spacing w:after="80" w:before="140"/>
+        <w:spacing w:after="100" w:before="0"/>
       </w:pPr>
       <w:r>
         <w:rPr>
@@ -19425,7 +20041,7 @@
           <w:sz w:val="18"/>
           <w:szCs w:val="18"/>
         </w:rPr>
-        <w:t xml:space="preserve">E. Identificación</w:t>
+        <w:t xml:space="preserve"/>
       </w:r>
     </w:p>
     <w:tbl>
@@ -19444,6 +20060,47 @@
         <w:gridCol w:w="2500"/>
         <w:gridCol w:w="7806"/>
       </w:tblGrid>
+      <w:tr>
+        <w:trPr>
+          <w:cantSplit/>
+          <w:tblHeader/>
+        </w:trPr>
+        <w:tc>
+          <w:tcPr>
+            <w:tcW w:type="dxa" w:w="10306"/>
+            <w:gridSpan w:val="2"/>
+            <w:tcBorders>
+              <w:top w:val="single" w:color="BFBFBF" w:sz="4"/>
+              <w:left w:val="single" w:color="BFBFBF" w:sz="4"/>
+              <w:bottom w:val="single" w:color="BFBFBF" w:sz="4"/>
+              <w:right w:val="single" w:color="BFBFBF" w:sz="4"/>
+            </w:tcBorders>
+            <w:shd w:fill="D9E2F3" w:color="auto" w:val="clear"/>
+            <w:tcMar>
+              <w:top w:type="dxa" w:w="40"/>
+              <w:left w:type="dxa" w:w="70"/>
+              <w:bottom w:type="dxa" w:w="40"/>
+              <w:right w:type="dxa" w:w="70"/>
+            </w:tcMar>
+          </w:tcPr>
+          <w:p>
+            <w:pPr>
+              <w:spacing w:after="0"/>
+            </w:pPr>
+            <w:r>
+              <w:rPr>
+                <w:rFonts w:ascii="Arial" w:cs="Arial" w:eastAsia="Arial" w:hAnsi="Arial"/>
+                <w:b/>
+                <w:bCs/>
+                <w:color w:val="1F3864"/>
+                <w:sz w:val="20"/>
+                <w:szCs w:val="20"/>
+              </w:rPr>
+              <w:t xml:space="preserve">E. Identificación</w:t>
+            </w:r>
+          </w:p>
+        </w:tc>
+      </w:tr>
       <w:tr>
         <w:trPr>
           <w:tblHeader/>
@@ -19519,7 +20176,7 @@
       </w:tr>
       <w:tr>
         <w:trPr>
-          <w:cantSplit/>
+          <w:cantSplit w:val="off"/>
         </w:trPr>
         <w:tc>
           <w:tcPr>
@@ -19703,7 +20360,7 @@
       </w:tr>
       <w:tr>
         <w:trPr>
-          <w:cantSplit/>
+          <w:cantSplit w:val="off"/>
         </w:trPr>
         <w:tc>
           <w:tcPr>
@@ -19911,7 +20568,7 @@
       </w:tr>
       <w:tr>
         <w:trPr>
-          <w:cantSplit/>
+          <w:cantSplit w:val="off"/>
         </w:trPr>
         <w:tc>
           <w:tcPr>
@@ -20095,7 +20752,7 @@
       </w:tr>
       <w:tr>
         <w:trPr>
-          <w:cantSplit/>
+          <w:cantSplit w:val="off"/>
         </w:trPr>
         <w:tc>
           <w:tcPr>
@@ -20279,7 +20936,7 @@
       </w:tr>
       <w:tr>
         <w:trPr>
-          <w:cantSplit/>
+          <w:cantSplit w:val="off"/>
         </w:trPr>
         <w:tc>
           <w:tcPr>

</xml_diff>